<commit_message>
"validación de intervalos bootstrap y estabilidad de correlaciones"
</commit_message>
<xml_diff>
--- a/S2/informe-sumativa-2.docx
+++ b/S2/informe-sumativa-2.docx
@@ -863,12 +863,980 @@
     <w:p>
       <w:pPr>
         <w:pStyle w:val="CuerpoInforme"/>
+        <w:spacing w:after="100" w:line="240" w:lineRule="auto"/>
+        <w:jc w:val="both"/>
       </w:pPr>
       <w:r>
         <w:rPr>
-          <w:highlight w:val="yellow"/>
+          <w:sz w:val="19"/>
         </w:rPr>
-        <w:t xml:space="preserve">[Bloque A] Completar esta sección (máx. 1,5 páginas).</w:t>
+        <w:t>Se aplicó bootstrap no paramétrico con 10.000 remuestras y semilla 42 a cinco resultados de la Sumativa 1: las medias de edad, presión arterial sistólica (PAS) y colesterol total, la proporción de CHD a 10 años y la diferencia de glucosa entre participantes con y sin CHD. En cada caso se conservaron los tamaños muestrales efectivos y se calcularon intervalos al 95 % por los métodos percentil y BCa. El primero usa directamente los cuantiles de la distribución remuestreada; BCa ajusta además por sesgo y aceleración mediante jackknife (Efron, 1987; Efron y Tibshirani, 1993).</w:t>
+      </w:r>
+    </w:p>
+    <w:tbl>
+      <w:tblPr>
+        <w:tblW w:type="auto" w:w="0"/>
+        <w:jc w:val="center"/>
+        <w:tblLayout w:type="fixed"/>
+        <w:tblLook w:firstColumn="1" w:firstRow="1" w:lastColumn="0" w:lastRow="0" w:noHBand="0" w:noVBand="1" w:val="04A0"/>
+        <w:tblBorders>
+          <w:top w:val="single" w:sz="4" w:color="D9D9D9"/>
+          <w:left w:val="single" w:sz="4" w:color="D9D9D9"/>
+          <w:bottom w:val="single" w:sz="4" w:color="D9D9D9"/>
+          <w:right w:val="single" w:sz="4" w:color="D9D9D9"/>
+          <w:insideH w:val="single" w:sz="4" w:color="D9D9D9"/>
+          <w:insideV w:val="single" w:sz="4" w:color="D9D9D9"/>
+        </w:tblBorders>
+      </w:tblPr>
+      <w:tblGrid>
+        <w:gridCol w:w="1512"/>
+        <w:gridCol w:w="1512"/>
+        <w:gridCol w:w="1512"/>
+        <w:gridCol w:w="1512"/>
+        <w:gridCol w:w="1512"/>
+        <w:gridCol w:w="1512"/>
+      </w:tblGrid>
+      <w:tr>
+        <w:trPr>
+          <w:tblHeader/>
+        </w:trPr>
+        <w:tc>
+          <w:tcPr>
+            <w:tcW w:type="dxa" w:w="2376"/>
+            <w:shd w:fill="1F4E78"/>
+            <w:vAlign w:val="center"/>
+            <w:tcMar>
+              <w:top w:w="70" w:type="dxa"/>
+              <w:left w:w="70" w:type="dxa"/>
+              <w:bottom w:w="70" w:type="dxa"/>
+              <w:right w:w="70" w:type="dxa"/>
+            </w:tcMar>
+          </w:tcPr>
+          <w:p>
+            <w:pPr>
+              <w:jc w:val="center"/>
+            </w:pPr>
+            <w:r>
+              <w:rPr>
+                <w:b/>
+                <w:sz w:val="15"/>
+                <w:color w:val="FFFFFF"/>
+              </w:rPr>
+              <w:t>Parámetro</w:t>
+            </w:r>
+          </w:p>
+        </w:tc>
+        <w:tc>
+          <w:tcPr>
+            <w:tcW w:type="dxa" w:w="936"/>
+            <w:shd w:fill="1F4E78"/>
+            <w:vAlign w:val="center"/>
+            <w:tcMar>
+              <w:top w:w="70" w:type="dxa"/>
+              <w:left w:w="70" w:type="dxa"/>
+              <w:bottom w:w="70" w:type="dxa"/>
+              <w:right w:w="70" w:type="dxa"/>
+            </w:tcMar>
+          </w:tcPr>
+          <w:p>
+            <w:pPr>
+              <w:jc w:val="center"/>
+            </w:pPr>
+            <w:r>
+              <w:rPr>
+                <w:b/>
+                <w:sz w:val="15"/>
+                <w:color w:val="FFFFFF"/>
+              </w:rPr>
+              <w:t>Estimación</w:t>
+            </w:r>
+          </w:p>
+        </w:tc>
+        <w:tc>
+          <w:tcPr>
+            <w:tcW w:type="dxa" w:w="1469"/>
+            <w:shd w:fill="1F4E78"/>
+            <w:vAlign w:val="center"/>
+            <w:tcMar>
+              <w:top w:w="70" w:type="dxa"/>
+              <w:left w:w="70" w:type="dxa"/>
+              <w:bottom w:w="70" w:type="dxa"/>
+              <w:right w:w="70" w:type="dxa"/>
+            </w:tcMar>
+          </w:tcPr>
+          <w:p>
+            <w:pPr>
+              <w:jc w:val="center"/>
+            </w:pPr>
+            <w:r>
+              <w:rPr>
+                <w:b/>
+                <w:sz w:val="15"/>
+                <w:color w:val="FFFFFF"/>
+              </w:rPr>
+              <w:t>IC S1</w:t>
+            </w:r>
+          </w:p>
+        </w:tc>
+        <w:tc>
+          <w:tcPr>
+            <w:tcW w:type="dxa" w:w="1469"/>
+            <w:shd w:fill="1F4E78"/>
+            <w:vAlign w:val="center"/>
+            <w:tcMar>
+              <w:top w:w="70" w:type="dxa"/>
+              <w:left w:w="70" w:type="dxa"/>
+              <w:bottom w:w="70" w:type="dxa"/>
+              <w:right w:w="70" w:type="dxa"/>
+            </w:tcMar>
+          </w:tcPr>
+          <w:p>
+            <w:pPr>
+              <w:jc w:val="center"/>
+            </w:pPr>
+            <w:r>
+              <w:rPr>
+                <w:b/>
+                <w:sz w:val="15"/>
+                <w:color w:val="FFFFFF"/>
+              </w:rPr>
+              <w:t>IC percentil</w:t>
+            </w:r>
+          </w:p>
+        </w:tc>
+        <w:tc>
+          <w:tcPr>
+            <w:tcW w:type="dxa" w:w="1469"/>
+            <w:shd w:fill="1F4E78"/>
+            <w:vAlign w:val="center"/>
+            <w:tcMar>
+              <w:top w:w="70" w:type="dxa"/>
+              <w:left w:w="70" w:type="dxa"/>
+              <w:bottom w:w="70" w:type="dxa"/>
+              <w:right w:w="70" w:type="dxa"/>
+            </w:tcMar>
+          </w:tcPr>
+          <w:p>
+            <w:pPr>
+              <w:jc w:val="center"/>
+            </w:pPr>
+            <w:r>
+              <w:rPr>
+                <w:b/>
+                <w:sz w:val="15"/>
+                <w:color w:val="FFFFFF"/>
+              </w:rPr>
+              <w:t>IC BCa</w:t>
+            </w:r>
+          </w:p>
+        </w:tc>
+        <w:tc>
+          <w:tcPr>
+            <w:tcW w:type="dxa" w:w="1080"/>
+            <w:shd w:fill="1F4E78"/>
+            <w:vAlign w:val="center"/>
+            <w:tcMar>
+              <w:top w:w="70" w:type="dxa"/>
+              <w:left w:w="70" w:type="dxa"/>
+              <w:bottom w:w="70" w:type="dxa"/>
+              <w:right w:w="70" w:type="dxa"/>
+            </w:tcMar>
+          </w:tcPr>
+          <w:p>
+            <w:pPr>
+              <w:jc w:val="center"/>
+            </w:pPr>
+            <w:r>
+              <w:rPr>
+                <w:b/>
+                <w:sz w:val="15"/>
+                <w:color w:val="FFFFFF"/>
+              </w:rPr>
+              <w:t>n</w:t>
+            </w:r>
+          </w:p>
+        </w:tc>
+      </w:tr>
+      <w:tr>
+        <w:tc>
+          <w:tcPr>
+            <w:tcW w:type="dxa" w:w="2376"/>
+            <w:vAlign w:val="center"/>
+            <w:tcMar>
+              <w:top w:w="70" w:type="dxa"/>
+              <w:left w:w="70" w:type="dxa"/>
+              <w:bottom w:w="70" w:type="dxa"/>
+              <w:right w:w="70" w:type="dxa"/>
+            </w:tcMar>
+          </w:tcPr>
+          <w:p>
+            <w:pPr>
+              <w:jc w:val="left"/>
+            </w:pPr>
+            <w:r>
+              <w:rPr>
+                <w:sz w:val="15"/>
+              </w:rPr>
+              <w:t>Edad media (años)</w:t>
+            </w:r>
+          </w:p>
+        </w:tc>
+        <w:tc>
+          <w:tcPr>
+            <w:tcW w:type="dxa" w:w="936"/>
+            <w:vAlign w:val="center"/>
+            <w:tcMar>
+              <w:top w:w="70" w:type="dxa"/>
+              <w:left w:w="70" w:type="dxa"/>
+              <w:bottom w:w="70" w:type="dxa"/>
+              <w:right w:w="70" w:type="dxa"/>
+            </w:tcMar>
+          </w:tcPr>
+          <w:p>
+            <w:pPr>
+              <w:jc w:val="center"/>
+            </w:pPr>
+            <w:r>
+              <w:rPr>
+                <w:sz w:val="15"/>
+              </w:rPr>
+              <w:t>49,58</w:t>
+            </w:r>
+          </w:p>
+        </w:tc>
+        <w:tc>
+          <w:tcPr>
+            <w:tcW w:type="dxa" w:w="1469"/>
+            <w:vAlign w:val="center"/>
+            <w:tcMar>
+              <w:top w:w="70" w:type="dxa"/>
+              <w:left w:w="70" w:type="dxa"/>
+              <w:bottom w:w="70" w:type="dxa"/>
+              <w:right w:w="70" w:type="dxa"/>
+            </w:tcMar>
+          </w:tcPr>
+          <w:p>
+            <w:pPr>
+              <w:jc w:val="center"/>
+            </w:pPr>
+            <w:r>
+              <w:rPr>
+                <w:sz w:val="15"/>
+              </w:rPr>
+              <w:t>[49,32; 49,84]</w:t>
+            </w:r>
+          </w:p>
+        </w:tc>
+        <w:tc>
+          <w:tcPr>
+            <w:tcW w:type="dxa" w:w="1469"/>
+            <w:vAlign w:val="center"/>
+            <w:tcMar>
+              <w:top w:w="70" w:type="dxa"/>
+              <w:left w:w="70" w:type="dxa"/>
+              <w:bottom w:w="70" w:type="dxa"/>
+              <w:right w:w="70" w:type="dxa"/>
+            </w:tcMar>
+          </w:tcPr>
+          <w:p>
+            <w:pPr>
+              <w:jc w:val="center"/>
+            </w:pPr>
+            <w:r>
+              <w:rPr>
+                <w:sz w:val="15"/>
+              </w:rPr>
+              <w:t>[49,32; 49,85]</w:t>
+            </w:r>
+          </w:p>
+        </w:tc>
+        <w:tc>
+          <w:tcPr>
+            <w:tcW w:type="dxa" w:w="1469"/>
+            <w:vAlign w:val="center"/>
+            <w:tcMar>
+              <w:top w:w="70" w:type="dxa"/>
+              <w:left w:w="70" w:type="dxa"/>
+              <w:bottom w:w="70" w:type="dxa"/>
+              <w:right w:w="70" w:type="dxa"/>
+            </w:tcMar>
+          </w:tcPr>
+          <w:p>
+            <w:pPr>
+              <w:jc w:val="center"/>
+            </w:pPr>
+            <w:r>
+              <w:rPr>
+                <w:sz w:val="15"/>
+              </w:rPr>
+              <w:t>[49,32; 49,85]</w:t>
+            </w:r>
+          </w:p>
+        </w:tc>
+        <w:tc>
+          <w:tcPr>
+            <w:tcW w:type="dxa" w:w="1080"/>
+            <w:vAlign w:val="center"/>
+            <w:tcMar>
+              <w:top w:w="70" w:type="dxa"/>
+              <w:left w:w="70" w:type="dxa"/>
+              <w:bottom w:w="70" w:type="dxa"/>
+              <w:right w:w="70" w:type="dxa"/>
+            </w:tcMar>
+          </w:tcPr>
+          <w:p>
+            <w:pPr>
+              <w:jc w:val="center"/>
+            </w:pPr>
+            <w:r>
+              <w:rPr>
+                <w:sz w:val="15"/>
+              </w:rPr>
+              <w:t>4.240</w:t>
+            </w:r>
+          </w:p>
+        </w:tc>
+      </w:tr>
+      <w:tr>
+        <w:tc>
+          <w:tcPr>
+            <w:tcW w:type="dxa" w:w="2376"/>
+            <w:vAlign w:val="center"/>
+            <w:shd w:fill="EAF2F8"/>
+            <w:tcMar>
+              <w:top w:w="70" w:type="dxa"/>
+              <w:left w:w="70" w:type="dxa"/>
+              <w:bottom w:w="70" w:type="dxa"/>
+              <w:right w:w="70" w:type="dxa"/>
+            </w:tcMar>
+          </w:tcPr>
+          <w:p>
+            <w:pPr>
+              <w:jc w:val="left"/>
+            </w:pPr>
+            <w:r>
+              <w:rPr>
+                <w:sz w:val="15"/>
+              </w:rPr>
+              <w:t>PAS media (mmHg)</w:t>
+            </w:r>
+          </w:p>
+        </w:tc>
+        <w:tc>
+          <w:tcPr>
+            <w:tcW w:type="dxa" w:w="936"/>
+            <w:vAlign w:val="center"/>
+            <w:shd w:fill="EAF2F8"/>
+            <w:tcMar>
+              <w:top w:w="70" w:type="dxa"/>
+              <w:left w:w="70" w:type="dxa"/>
+              <w:bottom w:w="70" w:type="dxa"/>
+              <w:right w:w="70" w:type="dxa"/>
+            </w:tcMar>
+          </w:tcPr>
+          <w:p>
+            <w:pPr>
+              <w:jc w:val="center"/>
+            </w:pPr>
+            <w:r>
+              <w:rPr>
+                <w:sz w:val="15"/>
+              </w:rPr>
+              <w:t>132,35</w:t>
+            </w:r>
+          </w:p>
+        </w:tc>
+        <w:tc>
+          <w:tcPr>
+            <w:tcW w:type="dxa" w:w="1469"/>
+            <w:vAlign w:val="center"/>
+            <w:shd w:fill="EAF2F8"/>
+            <w:tcMar>
+              <w:top w:w="70" w:type="dxa"/>
+              <w:left w:w="70" w:type="dxa"/>
+              <w:bottom w:w="70" w:type="dxa"/>
+              <w:right w:w="70" w:type="dxa"/>
+            </w:tcMar>
+          </w:tcPr>
+          <w:p>
+            <w:pPr>
+              <w:jc w:val="center"/>
+            </w:pPr>
+            <w:r>
+              <w:rPr>
+                <w:sz w:val="15"/>
+              </w:rPr>
+              <w:t>[131,69; 133,02]</w:t>
+            </w:r>
+          </w:p>
+        </w:tc>
+        <w:tc>
+          <w:tcPr>
+            <w:tcW w:type="dxa" w:w="1469"/>
+            <w:vAlign w:val="center"/>
+            <w:shd w:fill="EAF2F8"/>
+            <w:tcMar>
+              <w:top w:w="70" w:type="dxa"/>
+              <w:left w:w="70" w:type="dxa"/>
+              <w:bottom w:w="70" w:type="dxa"/>
+              <w:right w:w="70" w:type="dxa"/>
+            </w:tcMar>
+          </w:tcPr>
+          <w:p>
+            <w:pPr>
+              <w:jc w:val="center"/>
+            </w:pPr>
+            <w:r>
+              <w:rPr>
+                <w:sz w:val="15"/>
+              </w:rPr>
+              <w:t>[131,69; 133,02]</w:t>
+            </w:r>
+          </w:p>
+        </w:tc>
+        <w:tc>
+          <w:tcPr>
+            <w:tcW w:type="dxa" w:w="1469"/>
+            <w:vAlign w:val="center"/>
+            <w:shd w:fill="EAF2F8"/>
+            <w:tcMar>
+              <w:top w:w="70" w:type="dxa"/>
+              <w:left w:w="70" w:type="dxa"/>
+              <w:bottom w:w="70" w:type="dxa"/>
+              <w:right w:w="70" w:type="dxa"/>
+            </w:tcMar>
+          </w:tcPr>
+          <w:p>
+            <w:pPr>
+              <w:jc w:val="center"/>
+            </w:pPr>
+            <w:r>
+              <w:rPr>
+                <w:sz w:val="15"/>
+              </w:rPr>
+              <w:t>[131,70; 133,02]</w:t>
+            </w:r>
+          </w:p>
+        </w:tc>
+        <w:tc>
+          <w:tcPr>
+            <w:tcW w:type="dxa" w:w="1080"/>
+            <w:vAlign w:val="center"/>
+            <w:shd w:fill="EAF2F8"/>
+            <w:tcMar>
+              <w:top w:w="70" w:type="dxa"/>
+              <w:left w:w="70" w:type="dxa"/>
+              <w:bottom w:w="70" w:type="dxa"/>
+              <w:right w:w="70" w:type="dxa"/>
+            </w:tcMar>
+          </w:tcPr>
+          <w:p>
+            <w:pPr>
+              <w:jc w:val="center"/>
+            </w:pPr>
+            <w:r>
+              <w:rPr>
+                <w:sz w:val="15"/>
+              </w:rPr>
+              <w:t>4.240</w:t>
+            </w:r>
+          </w:p>
+        </w:tc>
+      </w:tr>
+      <w:tr>
+        <w:tc>
+          <w:tcPr>
+            <w:tcW w:type="dxa" w:w="2376"/>
+            <w:vAlign w:val="center"/>
+            <w:tcMar>
+              <w:top w:w="70" w:type="dxa"/>
+              <w:left w:w="70" w:type="dxa"/>
+              <w:bottom w:w="70" w:type="dxa"/>
+              <w:right w:w="70" w:type="dxa"/>
+            </w:tcMar>
+          </w:tcPr>
+          <w:p>
+            <w:pPr>
+              <w:jc w:val="left"/>
+            </w:pPr>
+            <w:r>
+              <w:rPr>
+                <w:sz w:val="15"/>
+              </w:rPr>
+              <w:t>Colesterol medio (mg/dL)</w:t>
+            </w:r>
+          </w:p>
+        </w:tc>
+        <w:tc>
+          <w:tcPr>
+            <w:tcW w:type="dxa" w:w="936"/>
+            <w:vAlign w:val="center"/>
+            <w:tcMar>
+              <w:top w:w="70" w:type="dxa"/>
+              <w:left w:w="70" w:type="dxa"/>
+              <w:bottom w:w="70" w:type="dxa"/>
+              <w:right w:w="70" w:type="dxa"/>
+            </w:tcMar>
+          </w:tcPr>
+          <w:p>
+            <w:pPr>
+              <w:jc w:val="center"/>
+            </w:pPr>
+            <w:r>
+              <w:rPr>
+                <w:sz w:val="15"/>
+              </w:rPr>
+              <w:t>236,70</w:t>
+            </w:r>
+          </w:p>
+        </w:tc>
+        <w:tc>
+          <w:tcPr>
+            <w:tcW w:type="dxa" w:w="1469"/>
+            <w:vAlign w:val="center"/>
+            <w:tcMar>
+              <w:top w:w="70" w:type="dxa"/>
+              <w:left w:w="70" w:type="dxa"/>
+              <w:bottom w:w="70" w:type="dxa"/>
+              <w:right w:w="70" w:type="dxa"/>
+            </w:tcMar>
+          </w:tcPr>
+          <w:p>
+            <w:pPr>
+              <w:jc w:val="center"/>
+            </w:pPr>
+            <w:r>
+              <w:rPr>
+                <w:sz w:val="15"/>
+              </w:rPr>
+              <w:t>[235,35; 238,05]</w:t>
+            </w:r>
+          </w:p>
+        </w:tc>
+        <w:tc>
+          <w:tcPr>
+            <w:tcW w:type="dxa" w:w="1469"/>
+            <w:vAlign w:val="center"/>
+            <w:tcMar>
+              <w:top w:w="70" w:type="dxa"/>
+              <w:left w:w="70" w:type="dxa"/>
+              <w:bottom w:w="70" w:type="dxa"/>
+              <w:right w:w="70" w:type="dxa"/>
+            </w:tcMar>
+          </w:tcPr>
+          <w:p>
+            <w:pPr>
+              <w:jc w:val="center"/>
+            </w:pPr>
+            <w:r>
+              <w:rPr>
+                <w:sz w:val="15"/>
+              </w:rPr>
+              <w:t>[235,36; 238,05]</w:t>
+            </w:r>
+          </w:p>
+        </w:tc>
+        <w:tc>
+          <w:tcPr>
+            <w:tcW w:type="dxa" w:w="1469"/>
+            <w:vAlign w:val="center"/>
+            <w:tcMar>
+              <w:top w:w="70" w:type="dxa"/>
+              <w:left w:w="70" w:type="dxa"/>
+              <w:bottom w:w="70" w:type="dxa"/>
+              <w:right w:w="70" w:type="dxa"/>
+            </w:tcMar>
+          </w:tcPr>
+          <w:p>
+            <w:pPr>
+              <w:jc w:val="center"/>
+            </w:pPr>
+            <w:r>
+              <w:rPr>
+                <w:sz w:val="15"/>
+              </w:rPr>
+              <w:t>[235,36; 238,05]</w:t>
+            </w:r>
+          </w:p>
+        </w:tc>
+        <w:tc>
+          <w:tcPr>
+            <w:tcW w:type="dxa" w:w="1080"/>
+            <w:vAlign w:val="center"/>
+            <w:tcMar>
+              <w:top w:w="70" w:type="dxa"/>
+              <w:left w:w="70" w:type="dxa"/>
+              <w:bottom w:w="70" w:type="dxa"/>
+              <w:right w:w="70" w:type="dxa"/>
+            </w:tcMar>
+          </w:tcPr>
+          <w:p>
+            <w:pPr>
+              <w:jc w:val="center"/>
+            </w:pPr>
+            <w:r>
+              <w:rPr>
+                <w:sz w:val="15"/>
+              </w:rPr>
+              <w:t>4.190</w:t>
+            </w:r>
+          </w:p>
+        </w:tc>
+      </w:tr>
+      <w:tr>
+        <w:tc>
+          <w:tcPr>
+            <w:tcW w:type="dxa" w:w="2376"/>
+            <w:vAlign w:val="center"/>
+            <w:shd w:fill="EAF2F8"/>
+            <w:tcMar>
+              <w:top w:w="70" w:type="dxa"/>
+              <w:left w:w="70" w:type="dxa"/>
+              <w:bottom w:w="70" w:type="dxa"/>
+              <w:right w:w="70" w:type="dxa"/>
+            </w:tcMar>
+          </w:tcPr>
+          <w:p>
+            <w:pPr>
+              <w:jc w:val="left"/>
+            </w:pPr>
+            <w:r>
+              <w:rPr>
+                <w:sz w:val="15"/>
+              </w:rPr>
+              <w:t>Proporción CHD (%)</w:t>
+            </w:r>
+          </w:p>
+        </w:tc>
+        <w:tc>
+          <w:tcPr>
+            <w:tcW w:type="dxa" w:w="936"/>
+            <w:vAlign w:val="center"/>
+            <w:shd w:fill="EAF2F8"/>
+            <w:tcMar>
+              <w:top w:w="70" w:type="dxa"/>
+              <w:left w:w="70" w:type="dxa"/>
+              <w:bottom w:w="70" w:type="dxa"/>
+              <w:right w:w="70" w:type="dxa"/>
+            </w:tcMar>
+          </w:tcPr>
+          <w:p>
+            <w:pPr>
+              <w:jc w:val="center"/>
+            </w:pPr>
+            <w:r>
+              <w:rPr>
+                <w:sz w:val="15"/>
+              </w:rPr>
+              <w:t>15,19</w:t>
+            </w:r>
+          </w:p>
+        </w:tc>
+        <w:tc>
+          <w:tcPr>
+            <w:tcW w:type="dxa" w:w="1469"/>
+            <w:vAlign w:val="center"/>
+            <w:shd w:fill="EAF2F8"/>
+            <w:tcMar>
+              <w:top w:w="70" w:type="dxa"/>
+              <w:left w:w="70" w:type="dxa"/>
+              <w:bottom w:w="70" w:type="dxa"/>
+              <w:right w:w="70" w:type="dxa"/>
+            </w:tcMar>
+          </w:tcPr>
+          <w:p>
+            <w:pPr>
+              <w:jc w:val="center"/>
+            </w:pPr>
+            <w:r>
+              <w:rPr>
+                <w:sz w:val="15"/>
+              </w:rPr>
+              <w:t>[14,14; 16,30]</w:t>
+            </w:r>
+          </w:p>
+        </w:tc>
+        <w:tc>
+          <w:tcPr>
+            <w:tcW w:type="dxa" w:w="1469"/>
+            <w:vAlign w:val="center"/>
+            <w:shd w:fill="EAF2F8"/>
+            <w:tcMar>
+              <w:top w:w="70" w:type="dxa"/>
+              <w:left w:w="70" w:type="dxa"/>
+              <w:bottom w:w="70" w:type="dxa"/>
+              <w:right w:w="70" w:type="dxa"/>
+            </w:tcMar>
+          </w:tcPr>
+          <w:p>
+            <w:pPr>
+              <w:jc w:val="center"/>
+            </w:pPr>
+            <w:r>
+              <w:rPr>
+                <w:sz w:val="15"/>
+              </w:rPr>
+              <w:t>[14,10; 16,25]</w:t>
+            </w:r>
+          </w:p>
+        </w:tc>
+        <w:tc>
+          <w:tcPr>
+            <w:tcW w:type="dxa" w:w="1469"/>
+            <w:vAlign w:val="center"/>
+            <w:shd w:fill="EAF2F8"/>
+            <w:tcMar>
+              <w:top w:w="70" w:type="dxa"/>
+              <w:left w:w="70" w:type="dxa"/>
+              <w:bottom w:w="70" w:type="dxa"/>
+              <w:right w:w="70" w:type="dxa"/>
+            </w:tcMar>
+          </w:tcPr>
+          <w:p>
+            <w:pPr>
+              <w:jc w:val="center"/>
+            </w:pPr>
+            <w:r>
+              <w:rPr>
+                <w:sz w:val="15"/>
+              </w:rPr>
+              <w:t>[14,15; 16,27]</w:t>
+            </w:r>
+          </w:p>
+        </w:tc>
+        <w:tc>
+          <w:tcPr>
+            <w:tcW w:type="dxa" w:w="1080"/>
+            <w:vAlign w:val="center"/>
+            <w:shd w:fill="EAF2F8"/>
+            <w:tcMar>
+              <w:top w:w="70" w:type="dxa"/>
+              <w:left w:w="70" w:type="dxa"/>
+              <w:bottom w:w="70" w:type="dxa"/>
+              <w:right w:w="70" w:type="dxa"/>
+            </w:tcMar>
+          </w:tcPr>
+          <w:p>
+            <w:pPr>
+              <w:jc w:val="center"/>
+            </w:pPr>
+            <w:r>
+              <w:rPr>
+                <w:sz w:val="15"/>
+              </w:rPr>
+              <w:t>4.240</w:t>
+            </w:r>
+          </w:p>
+        </w:tc>
+      </w:tr>
+      <w:tr>
+        <w:tc>
+          <w:tcPr>
+            <w:tcW w:type="dxa" w:w="2376"/>
+            <w:vAlign w:val="center"/>
+            <w:tcMar>
+              <w:top w:w="70" w:type="dxa"/>
+              <w:left w:w="70" w:type="dxa"/>
+              <w:bottom w:w="70" w:type="dxa"/>
+              <w:right w:w="70" w:type="dxa"/>
+            </w:tcMar>
+          </w:tcPr>
+          <w:p>
+            <w:pPr>
+              <w:jc w:val="left"/>
+            </w:pPr>
+            <w:r>
+              <w:rPr>
+                <w:sz w:val="15"/>
+              </w:rPr>
+              <w:t>Diferencia de glucosa (mg/dL)</w:t>
+            </w:r>
+          </w:p>
+        </w:tc>
+        <w:tc>
+          <w:tcPr>
+            <w:tcW w:type="dxa" w:w="936"/>
+            <w:vAlign w:val="center"/>
+            <w:tcMar>
+              <w:top w:w="70" w:type="dxa"/>
+              <w:left w:w="70" w:type="dxa"/>
+              <w:bottom w:w="70" w:type="dxa"/>
+              <w:right w:w="70" w:type="dxa"/>
+            </w:tcMar>
+          </w:tcPr>
+          <w:p>
+            <w:pPr>
+              <w:jc w:val="center"/>
+            </w:pPr>
+            <w:r>
+              <w:rPr>
+                <w:sz w:val="15"/>
+              </w:rPr>
+              <w:t>8,33</w:t>
+            </w:r>
+          </w:p>
+        </w:tc>
+        <w:tc>
+          <w:tcPr>
+            <w:tcW w:type="dxa" w:w="1469"/>
+            <w:vAlign w:val="center"/>
+            <w:tcMar>
+              <w:top w:w="70" w:type="dxa"/>
+              <w:left w:w="70" w:type="dxa"/>
+              <w:bottom w:w="70" w:type="dxa"/>
+              <w:right w:w="70" w:type="dxa"/>
+            </w:tcMar>
+          </w:tcPr>
+          <w:p>
+            <w:pPr>
+              <w:jc w:val="center"/>
+            </w:pPr>
+            <w:r>
+              <w:rPr>
+                <w:sz w:val="15"/>
+              </w:rPr>
+              <w:t>[4,95; 11,71]</w:t>
+            </w:r>
+          </w:p>
+        </w:tc>
+        <w:tc>
+          <w:tcPr>
+            <w:tcW w:type="dxa" w:w="1469"/>
+            <w:vAlign w:val="center"/>
+            <w:tcMar>
+              <w:top w:w="70" w:type="dxa"/>
+              <w:left w:w="70" w:type="dxa"/>
+              <w:bottom w:w="70" w:type="dxa"/>
+              <w:right w:w="70" w:type="dxa"/>
+            </w:tcMar>
+          </w:tcPr>
+          <w:p>
+            <w:pPr>
+              <w:jc w:val="center"/>
+            </w:pPr>
+            <w:r>
+              <w:rPr>
+                <w:sz w:val="15"/>
+              </w:rPr>
+              <w:t>[5,10; 11,83]</w:t>
+            </w:r>
+          </w:p>
+        </w:tc>
+        <w:tc>
+          <w:tcPr>
+            <w:tcW w:type="dxa" w:w="1469"/>
+            <w:vAlign w:val="center"/>
+            <w:tcMar>
+              <w:top w:w="70" w:type="dxa"/>
+              <w:left w:w="70" w:type="dxa"/>
+              <w:bottom w:w="70" w:type="dxa"/>
+              <w:right w:w="70" w:type="dxa"/>
+            </w:tcMar>
+          </w:tcPr>
+          <w:p>
+            <w:pPr>
+              <w:jc w:val="center"/>
+            </w:pPr>
+            <w:r>
+              <w:rPr>
+                <w:sz w:val="15"/>
+              </w:rPr>
+              <w:t>[5,32; 12,16]</w:t>
+            </w:r>
+          </w:p>
+        </w:tc>
+        <w:tc>
+          <w:tcPr>
+            <w:tcW w:type="dxa" w:w="1080"/>
+            <w:vAlign w:val="center"/>
+            <w:tcMar>
+              <w:top w:w="70" w:type="dxa"/>
+              <w:left w:w="70" w:type="dxa"/>
+              <w:bottom w:w="70" w:type="dxa"/>
+              <w:right w:w="70" w:type="dxa"/>
+            </w:tcMar>
+          </w:tcPr>
+          <w:p>
+            <w:pPr>
+              <w:jc w:val="center"/>
+            </w:pPr>
+            <w:r>
+              <w:rPr>
+                <w:sz w:val="15"/>
+              </w:rPr>
+              <w:t>594 / 3.258</w:t>
+            </w:r>
+          </w:p>
+        </w:tc>
+      </w:tr>
+    </w:tbl>
+    <w:p>
+      <w:pPr>
+        <w:pStyle w:val="CuerpoInforme"/>
+        <w:spacing w:after="100" w:line="240" w:lineRule="auto"/>
+        <w:jc w:val="both"/>
+      </w:pPr>
+      <w:r>
+        <w:rPr>
+          <w:sz w:val="19"/>
+        </w:rPr>
+        <w:t>Los cuatro estimadores globales muestran una concordancia casi exacta entre los intervalos clásicos y bootstrap. El gran tamaño muestral estabiliza las medias mediante el Teorema Central del Límite, mientras que Wilson y bootstrap entregan resultados equivalentes para la proporción de CHD. La glucosa es la excepción relevante: su IC BCa [5,32; 12,16] se desplaza hacia valores mayores respecto de Welch [4,95; 11,71]. Esto no cambia la conclusión, porque ambos intervalos excluyen cero, pero sí evidencia incertidumbre asimétrica. La distribución de glucosa tiene cola derecha, valores cercanos a 400 mg/dL y mayor dispersión en el grupo con CHD; Welch impone simetría alrededor de la diferencia, mientras BCa corrige el sesgo y la aceleración observados. Por ello, BCa es más informativo en este caso, aunque la media sigue siendo sensible a extremos y a los 388 valores faltantes; conviene complementar con medianas o medias recortadas.</w:t>
+      </w:r>
+    </w:p>
+    <w:p>
+      <w:pPr>
+        <w:pStyle w:val="CuerpoInforme"/>
+        <w:keepNext/>
+        <w:spacing w:before="40" w:after="40"/>
+        <w:jc w:val="center"/>
+      </w:pPr>
+      <w:r>
+        <w:drawing>
+          <wp:inline xmlns:a="http://schemas.openxmlformats.org/drawingml/2006/main" xmlns:pic="http://schemas.openxmlformats.org/drawingml/2006/picture">
+            <wp:extent cx="5394960" cy="3149659"/>
+            <wp:docPr id="303" name="Picture 303"/>
+            <wp:cNvGraphicFramePr>
+              <a:graphicFrameLocks noChangeAspect="1"/>
+            </wp:cNvGraphicFramePr>
+            <a:graphic>
+              <a:graphicData uri="http://schemas.openxmlformats.org/drawingml/2006/picture">
+                <pic:pic>
+                  <pic:nvPicPr>
+                    <pic:cNvPr id="0" name="p1_fig1_distribuciones_bootstrap.png"/>
+                    <pic:cNvPicPr/>
+                  </pic:nvPicPr>
+                  <pic:blipFill>
+                    <a:blip r:embed="rId10"/>
+                    <a:stretch>
+                      <a:fillRect/>
+                    </a:stretch>
+                  </pic:blipFill>
+                  <pic:spPr>
+                    <a:xfrm>
+                      <a:off x="0" y="0"/>
+                      <a:ext cx="5394960" cy="3149659"/>
+                    </a:xfrm>
+                    <a:prstGeom prst="rect"/>
+                  </pic:spPr>
+                </pic:pic>
+              </a:graphicData>
+            </a:graphic>
+          </wp:inline>
+        </w:drawing>
+      </w:r>
+    </w:p>
+    <w:p>
+      <w:pPr>
+        <w:pStyle w:val="CuerpoInforme"/>
+        <w:spacing w:after="120"/>
+        <w:jc w:val="center"/>
+      </w:pPr>
+      <w:r>
+        <w:rPr>
+          <w:i/>
+          <w:sz w:val="16"/>
+        </w:rPr>
+        <w:t>Figura 1. Distribuciones bootstrap e intervalos de confianza al 95 % para los cinco estimadores.</w:t>
       </w:r>
     </w:p>
     <w:p>
@@ -905,12 +1873,70 @@
     <w:p>
       <w:pPr>
         <w:pStyle w:val="CuerpoInforme"/>
+        <w:spacing w:after="100" w:line="240" w:lineRule="auto"/>
+        <w:jc w:val="both"/>
       </w:pPr>
       <w:r>
         <w:rPr>
-          <w:highlight w:val="yellow"/>
+          <w:sz w:val="18"/>
         </w:rPr>
-        <w:t xml:space="preserve">[Bloque A] Completar esta sección (máx. 0,5 páginas).</w:t>
+        <w:t>Se remuestrearon filas completas 10.000 veces para cinco correlaciones de Spearman. Las relaciones PAS–PAD (ρ = 0,778; IC 95 % [0,763; 0,791]), edad–PAS (ρ = 0,391; [0,365; 0,417]) e IMC–PAD (ρ = 0,375; [0,348; 0,401]) son robustas: sus intervalos son estrechos y excluyen cero. Colesterol–glucosa es inestable (ρ = 0,030; [−0,002; 0,061]) porque el intervalo incluye cero. Cigarrillos–glucosa mantiene dirección negativa (ρ = −0,086; [−0,118; −0,055]), pero el efecto es débil; significación estable no implica relevancia clínica. Para la Sumativa 3, la fuerte relación entre ambas presiones aconseja evitar incorporarlas simultáneamente sin controlar colinealidad.</w:t>
+      </w:r>
+    </w:p>
+    <w:p>
+      <w:pPr>
+        <w:pStyle w:val="CuerpoInforme"/>
+        <w:keepNext/>
+        <w:spacing w:before="40" w:after="40"/>
+        <w:jc w:val="center"/>
+      </w:pPr>
+      <w:r>
+        <w:drawing>
+          <wp:inline xmlns:a="http://schemas.openxmlformats.org/drawingml/2006/main" xmlns:pic="http://schemas.openxmlformats.org/drawingml/2006/picture">
+            <wp:extent cx="4663440" cy="2644004"/>
+            <wp:docPr id="304" name="Picture 304"/>
+            <wp:cNvGraphicFramePr>
+              <a:graphicFrameLocks noChangeAspect="1"/>
+            </wp:cNvGraphicFramePr>
+            <a:graphic>
+              <a:graphicData uri="http://schemas.openxmlformats.org/drawingml/2006/picture">
+                <pic:pic>
+                  <pic:nvPicPr>
+                    <pic:cNvPr id="0" name="p3_fig2_ic_correlaciones.png"/>
+                    <pic:cNvPicPr/>
+                  </pic:nvPicPr>
+                  <pic:blipFill>
+                    <a:blip r:embed="rId11"/>
+                    <a:stretch>
+                      <a:fillRect/>
+                    </a:stretch>
+                  </pic:blipFill>
+                  <pic:spPr>
+                    <a:xfrm>
+                      <a:off x="0" y="0"/>
+                      <a:ext cx="4663440" cy="2644004"/>
+                    </a:xfrm>
+                    <a:prstGeom prst="rect"/>
+                  </pic:spPr>
+                </pic:pic>
+              </a:graphicData>
+            </a:graphic>
+          </wp:inline>
+        </w:drawing>
+      </w:r>
+    </w:p>
+    <w:p>
+      <w:pPr>
+        <w:pStyle w:val="CuerpoInforme"/>
+        <w:spacing w:after="100"/>
+        <w:jc w:val="center"/>
+      </w:pPr>
+      <w:r>
+        <w:rPr>
+          <w:i/>
+          <w:sz w:val="16"/>
+        </w:rPr>
+        <w:t>Figura 2. Correlaciones de Spearman e intervalos bootstrap percentil al 95 %.</w:t>
       </w:r>
     </w:p>
     <w:p>

</xml_diff>

<commit_message>
validación estadística y consolidación entregables de la Sumativa 2
</commit_message>
<xml_diff>
--- a/S2/informe-sumativa-2.docx
+++ b/S2/informe-sumativa-2.docx
@@ -1854,10 +1854,7 @@
         <w:pStyle w:val="CuerpoInforme"/>
       </w:pPr>
       <w:r>
-        <w:rPr>
-          <w:highlight w:val="yellow"/>
-        </w:rPr>
-        <w:t xml:space="preserve">[Bloque B] Completar esta sección (máx. 1 página).</w:t>
+        <w:t>Se revalidaron tres contrastes de la Sumativa 1 mediante 10.000 permutaciones. La diferencia de PAS entre participantes con y sin CHD fue 13,28 mmHg: tanto Welch (p &lt; 0,001) como la permutación (p &lt; 0,001) rechazan la igualdad de medias. Para tabaquismo y CHD, el contraste χ² con corrección de Yates (p = 0,221) y la permutación de la diferencia de tasas (p = 0,210) coinciden en no rechazar la independencia. Sin embargo, la permutación estratificada por edad y la prueba de Cochran–Mantel–Haenszel entregan p &lt; 0,001. La discrepancia no proviene del método computacional, sino de la confusión por edad: dentro de los estratos hasta 55 años, los fumadores presentan entre 4,2 y 5,5 puntos porcentuales más CHD, mientras que en mayores de 55 años el IC incluye cero. Las distribuciones nulas y su convergencia se presentan en el notebook. Para la siguiente fase, el tabaquismo debe evaluarse ajustado por edad y no solo mediante la comparación marginal.</w:t>
       </w:r>
     </w:p>
     <w:p>
@@ -2020,7 +2017,7 @@
         <w:pStyle w:val="CuerpoInforme"/>
       </w:pPr>
       <w:r>
-        <w:t xml:space="preserve">El escenario A es coherente con los datos reales: sin programa se esperan 151,7 casos por 1.000 personas (15,17 %), prácticamente igual a la tasa observada en la S1 (15,19 %; IC 95 %: 14,14 a 16,30). Los casos evitados aumentan en proporción a la cobertura del programa (Tabla 5 y Figura 5). Con 40 % de hipertensos controlados se evitan en promedio 17,1 casos (IC 95 %: 10 a 26), lo que equivale a controlar unos 7 hipertensos por caso evitado. Con 20 % de cobertura el beneficio es incierto, ya que solo el 35 % de las cohortes evita 10 casos o más. Incorporar la incertidumbre de los parámetros casi no cambia el resultado (la desviación estándar pasa de 4,1 a 4,5 casos): con más de 4.000 observaciones, la variabilidad se debe sobre todo al azar entre personas.</w:t>
+        <w:t>El escenario A es coherente con los datos reales: sin programa se esperan 151,7 casos por 1.000 personas (15,17 %), prácticamente igual a la tasa observada en la S1 (15,19 %; IC 95 %: 14,14 a 16,30). Los casos evitados aumentan en proporción a la cobertura del programa (Tabla 2 y Figura 3). Con 40 % de hipertensos controlados se evitan en promedio 17,1 casos (IC 95 %: 10 a 26), lo que equivale a controlar unos 7 hipertensos por caso evitado. Con 20 % de cobertura el beneficio es incierto, ya que solo el 35 % de las cohortes evita 10 casos o más. Incorporar la incertidumbre de los parámetros casi no cambia el resultado (la desviación estándar pasa de 4,1 a 4,5 casos): con más de 4.000 observaciones, la variabilidad se debe sobre todo al azar entre personas.</w:t>
       </w:r>
     </w:p>
     <w:p>
@@ -2029,14 +2026,7 @@
         <w:keepNext/>
       </w:pPr>
       <w:r>
-        <w:rPr>
-          <w:b/>
-          <w:bCs/>
-        </w:rPr>
-        <w:t xml:space="preserve">Tabla 5.</w:t>
-      </w:r>
-      <w:r>
-        <w:t xml:space="preserve"> Escenario A: casos de CHD a 10 años por 1.000 personas según la cobertura del programa (10.000 cohortes simuladas).</w:t>
+        <w:t>Tabla 2. Escenario A: casos de CHD a 10 años por 1.000 personas según la cobertura del programa (10.000 cohortes simuladas).</w:t>
       </w:r>
     </w:p>
     <w:tbl>
@@ -2542,14 +2532,7 @@
         <w:pStyle w:val="Caption"/>
       </w:pPr>
       <w:r>
-        <w:rPr>
-          <w:b/>
-          <w:bCs/>
-        </w:rPr>
-        <w:t xml:space="preserve">Figura 5.</w:t>
-      </w:r>
-      <w:r>
-        <w:t xml:space="preserve"> Escenario A: casos de CHD por cohorte con y sin programa (izquierda) y casos evitados según la cobertura del programa (derecha).</w:t>
+        <w:t>Figura 3. Escenario A: casos de CHD por cohorte con y sin programa (izquierda) y casos evitados según la cobertura del programa (derecha).</w:t>
       </w:r>
     </w:p>
     <w:p>
@@ -2557,7 +2540,7 @@
         <w:pStyle w:val="CuerpoInforme"/>
       </w:pPr>
       <w:r>
-        <w:t xml:space="preserve">En el escenario B, los datos sintéticos reproducen la media, la desviación estándar y la asimetría de ambos grupos. Con el tamaño muestral de la S1, el IC de Welch cubre la diferencia verdadera en el 95,1 % de las réplicas (error estándar Monte Carlo de 0,2 puntos porcentuales) y la prueba detecta la diferencia en todas ellas (Figura 6), por lo que la conclusión de la S1 no depende del supuesto de normalidad. En cambio, la cobertura baja a 92,7 % con 33 personas y la potencia cae a 52 % con 132. Por ello, no conviene sacar conclusiones en subgrupos pequeños, como diabetes (n = 109) o ACV previo (n = 25).</w:t>
+        <w:t>En el escenario B, los datos sintéticos reproducen la media, la desviación estándar y la asimetría de ambos grupos. Con el tamaño muestral de la S1, el IC de Welch cubre la diferencia verdadera en el 95,1 % de las réplicas (error estándar Monte Carlo de 0,2 puntos porcentuales) y la prueba detecta la diferencia en todas ellas (Figura 4), por lo que la conclusión de la S1 no depende del supuesto de normalidad. En cambio, la cobertura baja a 92,7 % con 33 personas y la potencia cae a 52 % con 132. Por ello, no conviene sacar conclusiones en subgrupos pequeños, como diabetes (n = 109) o ACV previo (n = 25).</w:t>
       </w:r>
     </w:p>
     <w:p>
@@ -2610,14 +2593,7 @@
         <w:pStyle w:val="Caption"/>
       </w:pPr>
       <w:r>
-        <w:rPr>
-          <w:b/>
-          <w:bCs/>
-        </w:rPr>
-        <w:t xml:space="preserve">Figura 6.</w:t>
-      </w:r>
-      <w:r>
-        <w:t xml:space="preserve"> Escenario B: cobertura del IC 95 % de Welch (izquierda) y potencia de la prueba (derecha) según el tamaño muestral, con datos sintéticos asimétricos.</w:t>
+        <w:t>Figura 4. Escenario B: cobertura del IC 95 % de Welch (izquierda) y potencia de la prueba (derecha) según el tamaño muestral, con datos sintéticos asimétricos.</w:t>
       </w:r>
     </w:p>
     <w:p>
@@ -2661,10 +2637,7 @@
         <w:pStyle w:val="CuerpoInforme"/>
       </w:pPr>
       <w:r>
-        <w:rPr>
-          <w:highlight w:val="yellow"/>
-        </w:rPr>
-        <w:t xml:space="preserve">[Bloque B] Completar esta sección (máx. 1 página).</w:t>
+        <w:t>El jackknife mostró que ninguna observación individual altera materialmente las medias: los mayores cambios al retirar un registro fueron 0,038 mmHg en PAS, 0,110 mg/dL en colesterol y 0,081 mg/dL en glucosa. Las medias globales son robustas; al excluir atípicos de Tukey cambian 1,55 % en PAS, 0,77 % en colesterol y 4,24 % en glucosa. La diferencia de PAS asociada con CHD conserva su significación con todos los métodos, aunque su magnitud baja 27,2 % sin atípicos. En cambio, la diferencia de glucosa es sensible: pasa de 8,33 a 0,83 mg/dL y deja de ser significativa al retirar atípicos; la diferencia de medianas es solo 1 mg/dL. Las correlaciones PAS–PAD y edad–PAS permanecen estables al comparar Spearman, Pearson y muestras sin atípicos. El VIF de PAS y PAD aumenta cuando ambas se incluyen, por lo que se conservará solo PAS. En síntesis, son confiables las medias globales, la proporción de CHD, la asociación PAS–CHD y las correlaciones principales; la diferencia de glucosa y el efecto marginal del tabaquismo requieren cautela y ajuste.</w:t>
       </w:r>
     </w:p>
     <w:p>
@@ -2692,10 +2665,7 @@
         <w:pStyle w:val="CuerpoInforme"/>
       </w:pPr>
       <w:r>
-        <w:rPr>
-          <w:highlight w:val="yellow"/>
-        </w:rPr>
-        <w:t xml:space="preserve">[Bloque C] Completar con la tabla de resultados validados.</w:t>
+        <w:t>El archivo de resultados validados consolida los IC BCa, las pruebas de permutación, las correlaciones estables, las observaciones influyentes y los escenarios Monte Carlo. Como insumos principales para la Sumativa 3 se mantienen: edad media 49,58 años (IC BCa [49,32; 49,85]), PAS media 132,35 mmHg ([131,70; 133,02]), colesterol medio 236,70 mg/dL ([235,36; 238,05]) y prevalencia de CHD de 15,19 % ([14,15 %; 16,27 %]). La diferencia de PAS por CHD se considera robusta en dirección, pero su magnitud debe acompañarse del análisis sin atípicos. La diferencia de glucosa no se utilizará como evidencia confirmatoria sin transformación o métodos robustos.</w:t>
       </w:r>
     </w:p>
     <w:p>
@@ -2760,10 +2730,7 @@
         <w:pStyle w:val="CuerpoInforme"/>
       </w:pPr>
       <w:r>
-        <w:rPr>
-          <w:highlight w:val="yellow"/>
-        </w:rPr>
-        <w:t xml:space="preserve">[Bloque C] Indicar qué presión se mantiene y por qué.</w:t>
+        <w:t>Mantener la presión sistólica y excluir la diastólica del modelo principal. Ambas muestran estabilidad, pero la sistólica está directamente vinculada con las hipótesis y la simulación de esta evaluación. Esta decisión deberá contrastarse mediante validación cruzada.</w:t>
       </w:r>
     </w:p>
     <w:p>

</xml_diff>

<commit_message>
refinamiento para la entrega
</commit_message>
<xml_diff>
--- a/S2/informe-sumativa-2.docx
+++ b/S2/informe-sumativa-2.docx
@@ -583,7 +583,7 @@
           <w:fldChar w:fldCharType="separate"/>
         </w:r>
         <w:r>
-          <w:t>3</w:t>
+          <w:t>4</w:t>
         </w:r>
         <w:r>
           <w:fldChar w:fldCharType="end"/>
@@ -611,7 +611,7 @@
           <w:fldChar w:fldCharType="separate"/>
         </w:r>
         <w:r>
-          <w:t>3</w:t>
+          <w:t>4</w:t>
         </w:r>
         <w:r>
           <w:fldChar w:fldCharType="end"/>
@@ -639,7 +639,7 @@
           <w:fldChar w:fldCharType="separate"/>
         </w:r>
         <w:r>
-          <w:t>3</w:t>
+          <w:t>5</w:t>
         </w:r>
         <w:r>
           <w:fldChar w:fldCharType="end"/>
@@ -667,7 +667,7 @@
           <w:fldChar w:fldCharType="separate"/>
         </w:r>
         <w:r>
-          <w:t>3</w:t>
+          <w:t>5</w:t>
         </w:r>
         <w:r>
           <w:fldChar w:fldCharType="end"/>
@@ -695,7 +695,7 @@
           <w:fldChar w:fldCharType="separate"/>
         </w:r>
         <w:r>
-          <w:t>4</w:t>
+          <w:t>6</w:t>
         </w:r>
         <w:r>
           <w:fldChar w:fldCharType="end"/>
@@ -723,7 +723,7 @@
           <w:fldChar w:fldCharType="separate"/>
         </w:r>
         <w:r>
-          <w:t>5</w:t>
+          <w:t>6</w:t>
         </w:r>
         <w:r>
           <w:fldChar w:fldCharType="end"/>
@@ -751,7 +751,7 @@
           <w:fldChar w:fldCharType="separate"/>
         </w:r>
         <w:r>
-          <w:t>5</w:t>
+          <w:t>7</w:t>
         </w:r>
         <w:r>
           <w:fldChar w:fldCharType="end"/>
@@ -779,7 +779,7 @@
           <w:fldChar w:fldCharType="separate"/>
         </w:r>
         <w:r>
-          <w:t>5</w:t>
+          <w:t>7</w:t>
         </w:r>
         <w:r>
           <w:fldChar w:fldCharType="end"/>
@@ -807,7 +807,7 @@
           <w:fldChar w:fldCharType="separate"/>
         </w:r>
         <w:r>
-          <w:t>5</w:t>
+          <w:t>7</w:t>
         </w:r>
         <w:r>
           <w:fldChar w:fldCharType="end"/>
@@ -835,7 +835,7 @@
           <w:fldChar w:fldCharType="separate"/>
         </w:r>
         <w:r>
-          <w:t>5</w:t>
+          <w:t>7</w:t>
         </w:r>
         <w:r>
           <w:fldChar w:fldCharType="end"/>
@@ -863,908 +863,755 @@
     <w:p>
       <w:pPr>
         <w:pStyle w:val="CuerpoInforme"/>
-        <w:spacing w:after="100" w:line="240" w:lineRule="auto"/>
-        <w:jc w:val="both"/>
+      </w:pPr>
+      <w:r>
+        <w:t xml:space="preserve">Se aplicó bootstrap no paramétrico con 10.000 remuestras y semilla 42 a seis resultados de la Sumativa 1 (Tabla 1): las medias de edad, presión arterial sistólica (PAS) y colesterol total, la proporción de CHD a 10 años y las diferencias de PAS y de glucosa entre participantes con y sin CHD. En cada caso se conservaron los tamaños muestrales efectivos y se calcularon intervalos al 95 % por los métodos percentil y BCa. El primero usa directamente los cuantiles de la distribución remuestreada; BCa ajusta además por sesgo y aceleración mediante jackknife (Efron, 1987; Efron y Tibshirani, 1993).</w:t>
+      </w:r>
+    </w:p>
+    <w:p>
+      <w:pPr>
+        <w:pStyle w:val="Caption"/>
+        <w:keepNext/>
       </w:pPr>
       <w:r>
         <w:rPr>
-          <w:sz w:val="19"/>
+          <w:b/>
+          <w:bCs/>
         </w:rPr>
-        <w:t>Se aplicó bootstrap no paramétrico con 10.000 remuestras y semilla 42 a cinco resultados de la Sumativa 1: las medias de edad, presión arterial sistólica (PAS) y colesterol total, la proporción de CHD a 10 años y la diferencia de glucosa entre participantes con y sin CHD. En cada caso se conservaron los tamaños muestrales efectivos y se calcularon intervalos al 95 % por los métodos percentil y BCa. El primero usa directamente los cuantiles de la distribución remuestreada; BCa ajusta además por sesgo y aceleración mediante jackknife (Efron, 1987; Efron y Tibshirani, 1993).</w:t>
+        <w:t xml:space="preserve">Tabla 1.</w:t>
+      </w:r>
+      <w:r>
+        <w:t xml:space="preserve"> Intervalos de confianza al 95 %: clásicos de la S1 y bootstrap percentil y BCa (10.000 remuestras).</w:t>
       </w:r>
     </w:p>
     <w:tbl>
       <w:tblPr>
-        <w:tblW w:type="auto" w:w="0"/>
+        <w:tblW w:w="9072" w:type="dxa"/>
         <w:jc w:val="center"/>
+        <w:tblBorders>
+          <w:top w:val="single" w:sz="8" w:space="0" w:color="000000"/>
+          <w:bottom w:val="single" w:sz="8" w:space="0" w:color="000000"/>
+        </w:tblBorders>
         <w:tblLayout w:type="fixed"/>
-        <w:tblLook w:firstColumn="1" w:firstRow="1" w:lastColumn="0" w:lastRow="0" w:noHBand="0" w:noVBand="1" w:val="04A0"/>
-        <w:tblBorders>
-          <w:top w:val="single" w:sz="4" w:color="D9D9D9"/>
-          <w:left w:val="single" w:sz="4" w:color="D9D9D9"/>
-          <w:bottom w:val="single" w:sz="4" w:color="D9D9D9"/>
-          <w:right w:val="single" w:sz="4" w:color="D9D9D9"/>
-          <w:insideH w:val="single" w:sz="4" w:color="D9D9D9"/>
-          <w:insideV w:val="single" w:sz="4" w:color="D9D9D9"/>
-        </w:tblBorders>
+        <w:tblCellMar>
+          <w:top w:w="30" w:type="dxa"/>
+          <w:left w:w="70" w:type="dxa"/>
+          <w:bottom w:w="30" w:type="dxa"/>
+          <w:right w:w="70" w:type="dxa"/>
+        </w:tblCellMar>
       </w:tblPr>
       <w:tblGrid>
-        <w:gridCol w:w="1512"/>
-        <w:gridCol w:w="1512"/>
-        <w:gridCol w:w="1512"/>
-        <w:gridCol w:w="1512"/>
-        <w:gridCol w:w="1512"/>
-        <w:gridCol w:w="1512"/>
+        <w:gridCol w:w="2472"/>
+        <w:gridCol w:w="1100"/>
+        <w:gridCol w:w="1500"/>
+        <w:gridCol w:w="1500"/>
+        <w:gridCol w:w="1500"/>
+        <w:gridCol w:w="1000"/>
       </w:tblGrid>
       <w:tr>
         <w:trPr>
+          <w:cantSplit/>
           <w:tblHeader/>
         </w:trPr>
         <w:tc>
           <w:tcPr>
-            <w:tcW w:type="dxa" w:w="2376"/>
-            <w:shd w:fill="1F4E78"/>
-            <w:vAlign w:val="center"/>
-            <w:tcMar>
-              <w:top w:w="70" w:type="dxa"/>
-              <w:left w:w="70" w:type="dxa"/>
-              <w:bottom w:w="70" w:type="dxa"/>
-              <w:right w:w="70" w:type="dxa"/>
-            </w:tcMar>
-          </w:tcPr>
-          <w:p>
-            <w:pPr>
-              <w:jc w:val="center"/>
+            <w:tcW w:w="2472" w:type="dxa"/>
+            <w:tcBorders>
+              <w:bottom w:val="single" w:sz="4" w:space="0" w:color="000000"/>
+            </w:tcBorders>
+            <w:vAlign w:val="center"/>
+          </w:tcPr>
+          <w:p>
+            <w:pPr>
+              <w:pStyle w:val="TablaInforme"/>
+              <w:jc w:val="left"/>
             </w:pPr>
             <w:r>
               <w:rPr>
                 <w:b/>
-                <w:sz w:val="15"/>
-                <w:color w:val="FFFFFF"/>
+                <w:bCs/>
               </w:rPr>
-              <w:t>Parámetro</w:t>
-            </w:r>
-          </w:p>
-        </w:tc>
-        <w:tc>
-          <w:tcPr>
-            <w:tcW w:type="dxa" w:w="936"/>
-            <w:shd w:fill="1F4E78"/>
-            <w:vAlign w:val="center"/>
-            <w:tcMar>
-              <w:top w:w="70" w:type="dxa"/>
-              <w:left w:w="70" w:type="dxa"/>
-              <w:bottom w:w="70" w:type="dxa"/>
-              <w:right w:w="70" w:type="dxa"/>
-            </w:tcMar>
-          </w:tcPr>
-          <w:p>
-            <w:pPr>
+              <w:t xml:space="preserve">Parámetro</w:t>
+            </w:r>
+          </w:p>
+        </w:tc>
+        <w:tc>
+          <w:tcPr>
+            <w:tcW w:w="1100" w:type="dxa"/>
+            <w:tcBorders>
+              <w:bottom w:val="single" w:sz="4" w:space="0" w:color="000000"/>
+            </w:tcBorders>
+            <w:vAlign w:val="center"/>
+          </w:tcPr>
+          <w:p>
+            <w:pPr>
+              <w:pStyle w:val="TablaInforme"/>
               <w:jc w:val="center"/>
             </w:pPr>
             <w:r>
               <w:rPr>
                 <w:b/>
-                <w:sz w:val="15"/>
-                <w:color w:val="FFFFFF"/>
+                <w:bCs/>
               </w:rPr>
-              <w:t>Estimación</w:t>
-            </w:r>
-          </w:p>
-        </w:tc>
-        <w:tc>
-          <w:tcPr>
-            <w:tcW w:type="dxa" w:w="1469"/>
-            <w:shd w:fill="1F4E78"/>
-            <w:vAlign w:val="center"/>
-            <w:tcMar>
-              <w:top w:w="70" w:type="dxa"/>
-              <w:left w:w="70" w:type="dxa"/>
-              <w:bottom w:w="70" w:type="dxa"/>
-              <w:right w:w="70" w:type="dxa"/>
-            </w:tcMar>
-          </w:tcPr>
-          <w:p>
-            <w:pPr>
+              <w:t xml:space="preserve">Estimación</w:t>
+            </w:r>
+          </w:p>
+        </w:tc>
+        <w:tc>
+          <w:tcPr>
+            <w:tcW w:w="1500" w:type="dxa"/>
+            <w:tcBorders>
+              <w:bottom w:val="single" w:sz="4" w:space="0" w:color="000000"/>
+            </w:tcBorders>
+            <w:vAlign w:val="center"/>
+          </w:tcPr>
+          <w:p>
+            <w:pPr>
+              <w:pStyle w:val="TablaInforme"/>
               <w:jc w:val="center"/>
             </w:pPr>
             <w:r>
               <w:rPr>
                 <w:b/>
-                <w:sz w:val="15"/>
-                <w:color w:val="FFFFFF"/>
+                <w:bCs/>
               </w:rPr>
-              <w:t>IC S1</w:t>
-            </w:r>
-          </w:p>
-        </w:tc>
-        <w:tc>
-          <w:tcPr>
-            <w:tcW w:type="dxa" w:w="1469"/>
-            <w:shd w:fill="1F4E78"/>
-            <w:vAlign w:val="center"/>
-            <w:tcMar>
-              <w:top w:w="70" w:type="dxa"/>
-              <w:left w:w="70" w:type="dxa"/>
-              <w:bottom w:w="70" w:type="dxa"/>
-              <w:right w:w="70" w:type="dxa"/>
-            </w:tcMar>
-          </w:tcPr>
-          <w:p>
-            <w:pPr>
+              <w:t xml:space="preserve">IC S1</w:t>
+            </w:r>
+          </w:p>
+        </w:tc>
+        <w:tc>
+          <w:tcPr>
+            <w:tcW w:w="1500" w:type="dxa"/>
+            <w:tcBorders>
+              <w:bottom w:val="single" w:sz="4" w:space="0" w:color="000000"/>
+            </w:tcBorders>
+            <w:vAlign w:val="center"/>
+          </w:tcPr>
+          <w:p>
+            <w:pPr>
+              <w:pStyle w:val="TablaInforme"/>
               <w:jc w:val="center"/>
             </w:pPr>
             <w:r>
               <w:rPr>
                 <w:b/>
-                <w:sz w:val="15"/>
-                <w:color w:val="FFFFFF"/>
+                <w:bCs/>
               </w:rPr>
-              <w:t>IC percentil</w:t>
-            </w:r>
-          </w:p>
-        </w:tc>
-        <w:tc>
-          <w:tcPr>
-            <w:tcW w:type="dxa" w:w="1469"/>
-            <w:shd w:fill="1F4E78"/>
-            <w:vAlign w:val="center"/>
-            <w:tcMar>
-              <w:top w:w="70" w:type="dxa"/>
-              <w:left w:w="70" w:type="dxa"/>
-              <w:bottom w:w="70" w:type="dxa"/>
-              <w:right w:w="70" w:type="dxa"/>
-            </w:tcMar>
-          </w:tcPr>
-          <w:p>
-            <w:pPr>
+              <w:t xml:space="preserve">IC percentil</w:t>
+            </w:r>
+          </w:p>
+        </w:tc>
+        <w:tc>
+          <w:tcPr>
+            <w:tcW w:w="1500" w:type="dxa"/>
+            <w:tcBorders>
+              <w:bottom w:val="single" w:sz="4" w:space="0" w:color="000000"/>
+            </w:tcBorders>
+            <w:vAlign w:val="center"/>
+          </w:tcPr>
+          <w:p>
+            <w:pPr>
+              <w:pStyle w:val="TablaInforme"/>
               <w:jc w:val="center"/>
             </w:pPr>
             <w:r>
               <w:rPr>
                 <w:b/>
-                <w:sz w:val="15"/>
-                <w:color w:val="FFFFFF"/>
+                <w:bCs/>
               </w:rPr>
-              <w:t>IC BCa</w:t>
-            </w:r>
-          </w:p>
-        </w:tc>
-        <w:tc>
-          <w:tcPr>
-            <w:tcW w:type="dxa" w:w="1080"/>
-            <w:shd w:fill="1F4E78"/>
-            <w:vAlign w:val="center"/>
-            <w:tcMar>
-              <w:top w:w="70" w:type="dxa"/>
-              <w:left w:w="70" w:type="dxa"/>
-              <w:bottom w:w="70" w:type="dxa"/>
-              <w:right w:w="70" w:type="dxa"/>
-            </w:tcMar>
-          </w:tcPr>
-          <w:p>
-            <w:pPr>
+              <w:t xml:space="preserve">IC BCa</w:t>
+            </w:r>
+          </w:p>
+        </w:tc>
+        <w:tc>
+          <w:tcPr>
+            <w:tcW w:w="1000" w:type="dxa"/>
+            <w:tcBorders>
+              <w:bottom w:val="single" w:sz="4" w:space="0" w:color="000000"/>
+            </w:tcBorders>
+            <w:vAlign w:val="center"/>
+          </w:tcPr>
+          <w:p>
+            <w:pPr>
+              <w:pStyle w:val="TablaInforme"/>
               <w:jc w:val="center"/>
             </w:pPr>
             <w:r>
               <w:rPr>
                 <w:b/>
-                <w:sz w:val="15"/>
-                <w:color w:val="FFFFFF"/>
+                <w:bCs/>
               </w:rPr>
-              <w:t>n</w:t>
+              <w:t xml:space="preserve">n</w:t>
             </w:r>
           </w:p>
         </w:tc>
       </w:tr>
       <w:tr>
-        <w:tc>
-          <w:tcPr>
-            <w:tcW w:type="dxa" w:w="2376"/>
-            <w:vAlign w:val="center"/>
-            <w:tcMar>
-              <w:top w:w="70" w:type="dxa"/>
-              <w:left w:w="70" w:type="dxa"/>
-              <w:bottom w:w="70" w:type="dxa"/>
-              <w:right w:w="70" w:type="dxa"/>
-            </w:tcMar>
-          </w:tcPr>
-          <w:p>
-            <w:pPr>
+        <w:trPr>
+          <w:cantSplit/>
+        </w:trPr>
+        <w:tc>
+          <w:tcPr>
+            <w:tcW w:w="2472" w:type="dxa"/>
+            <w:vAlign w:val="center"/>
+          </w:tcPr>
+          <w:p>
+            <w:pPr>
+              <w:pStyle w:val="TablaInforme"/>
               <w:jc w:val="left"/>
             </w:pPr>
             <w:r>
-              <w:rPr>
-                <w:sz w:val="15"/>
-              </w:rPr>
-              <w:t>Edad media (años)</w:t>
-            </w:r>
-          </w:p>
-        </w:tc>
-        <w:tc>
-          <w:tcPr>
-            <w:tcW w:type="dxa" w:w="936"/>
-            <w:vAlign w:val="center"/>
-            <w:tcMar>
-              <w:top w:w="70" w:type="dxa"/>
-              <w:left w:w="70" w:type="dxa"/>
-              <w:bottom w:w="70" w:type="dxa"/>
-              <w:right w:w="70" w:type="dxa"/>
-            </w:tcMar>
-          </w:tcPr>
-          <w:p>
-            <w:pPr>
-              <w:jc w:val="center"/>
-            </w:pPr>
-            <w:r>
-              <w:rPr>
-                <w:sz w:val="15"/>
-              </w:rPr>
-              <w:t>49,58</w:t>
-            </w:r>
-          </w:p>
-        </w:tc>
-        <w:tc>
-          <w:tcPr>
-            <w:tcW w:type="dxa" w:w="1469"/>
-            <w:vAlign w:val="center"/>
-            <w:tcMar>
-              <w:top w:w="70" w:type="dxa"/>
-              <w:left w:w="70" w:type="dxa"/>
-              <w:bottom w:w="70" w:type="dxa"/>
-              <w:right w:w="70" w:type="dxa"/>
-            </w:tcMar>
-          </w:tcPr>
-          <w:p>
-            <w:pPr>
-              <w:jc w:val="center"/>
-            </w:pPr>
-            <w:r>
-              <w:rPr>
-                <w:sz w:val="15"/>
-              </w:rPr>
-              <w:t>[49,32; 49,84]</w:t>
-            </w:r>
-          </w:p>
-        </w:tc>
-        <w:tc>
-          <w:tcPr>
-            <w:tcW w:type="dxa" w:w="1469"/>
-            <w:vAlign w:val="center"/>
-            <w:tcMar>
-              <w:top w:w="70" w:type="dxa"/>
-              <w:left w:w="70" w:type="dxa"/>
-              <w:bottom w:w="70" w:type="dxa"/>
-              <w:right w:w="70" w:type="dxa"/>
-            </w:tcMar>
-          </w:tcPr>
-          <w:p>
-            <w:pPr>
-              <w:jc w:val="center"/>
-            </w:pPr>
-            <w:r>
-              <w:rPr>
-                <w:sz w:val="15"/>
-              </w:rPr>
-              <w:t>[49,32; 49,85]</w:t>
-            </w:r>
-          </w:p>
-        </w:tc>
-        <w:tc>
-          <w:tcPr>
-            <w:tcW w:type="dxa" w:w="1469"/>
-            <w:vAlign w:val="center"/>
-            <w:tcMar>
-              <w:top w:w="70" w:type="dxa"/>
-              <w:left w:w="70" w:type="dxa"/>
-              <w:bottom w:w="70" w:type="dxa"/>
-              <w:right w:w="70" w:type="dxa"/>
-            </w:tcMar>
-          </w:tcPr>
-          <w:p>
-            <w:pPr>
-              <w:jc w:val="center"/>
-            </w:pPr>
-            <w:r>
-              <w:rPr>
-                <w:sz w:val="15"/>
-              </w:rPr>
-              <w:t>[49,32; 49,85]</w:t>
-            </w:r>
-          </w:p>
-        </w:tc>
-        <w:tc>
-          <w:tcPr>
-            <w:tcW w:type="dxa" w:w="1080"/>
-            <w:vAlign w:val="center"/>
-            <w:tcMar>
-              <w:top w:w="70" w:type="dxa"/>
-              <w:left w:w="70" w:type="dxa"/>
-              <w:bottom w:w="70" w:type="dxa"/>
-              <w:right w:w="70" w:type="dxa"/>
-            </w:tcMar>
-          </w:tcPr>
-          <w:p>
-            <w:pPr>
-              <w:jc w:val="center"/>
-            </w:pPr>
-            <w:r>
-              <w:rPr>
-                <w:sz w:val="15"/>
-              </w:rPr>
-              <w:t>4.240</w:t>
+              <w:t xml:space="preserve">Edad media (años)</w:t>
+            </w:r>
+          </w:p>
+        </w:tc>
+        <w:tc>
+          <w:tcPr>
+            <w:tcW w:w="1100" w:type="dxa"/>
+            <w:vAlign w:val="center"/>
+          </w:tcPr>
+          <w:p>
+            <w:pPr>
+              <w:pStyle w:val="TablaInforme"/>
+              <w:jc w:val="center"/>
+            </w:pPr>
+            <w:r>
+              <w:t xml:space="preserve">49,58</w:t>
+            </w:r>
+          </w:p>
+        </w:tc>
+        <w:tc>
+          <w:tcPr>
+            <w:tcW w:w="1500" w:type="dxa"/>
+            <w:vAlign w:val="center"/>
+          </w:tcPr>
+          <w:p>
+            <w:pPr>
+              <w:pStyle w:val="TablaInforme"/>
+              <w:jc w:val="center"/>
+            </w:pPr>
+            <w:r>
+              <w:t xml:space="preserve">[49,32; 49,84]</w:t>
+            </w:r>
+          </w:p>
+        </w:tc>
+        <w:tc>
+          <w:tcPr>
+            <w:tcW w:w="1500" w:type="dxa"/>
+            <w:vAlign w:val="center"/>
+          </w:tcPr>
+          <w:p>
+            <w:pPr>
+              <w:pStyle w:val="TablaInforme"/>
+              <w:jc w:val="center"/>
+            </w:pPr>
+            <w:r>
+              <w:t xml:space="preserve">[49,32; 49,85]</w:t>
+            </w:r>
+          </w:p>
+        </w:tc>
+        <w:tc>
+          <w:tcPr>
+            <w:tcW w:w="1500" w:type="dxa"/>
+            <w:vAlign w:val="center"/>
+          </w:tcPr>
+          <w:p>
+            <w:pPr>
+              <w:pStyle w:val="TablaInforme"/>
+              <w:jc w:val="center"/>
+            </w:pPr>
+            <w:r>
+              <w:t xml:space="preserve">[49,32; 49,85]</w:t>
+            </w:r>
+          </w:p>
+        </w:tc>
+        <w:tc>
+          <w:tcPr>
+            <w:tcW w:w="1000" w:type="dxa"/>
+            <w:vAlign w:val="center"/>
+          </w:tcPr>
+          <w:p>
+            <w:pPr>
+              <w:pStyle w:val="TablaInforme"/>
+              <w:jc w:val="center"/>
+            </w:pPr>
+            <w:r>
+              <w:t xml:space="preserve">4.240</w:t>
             </w:r>
           </w:p>
         </w:tc>
       </w:tr>
       <w:tr>
-        <w:tc>
-          <w:tcPr>
-            <w:tcW w:type="dxa" w:w="2376"/>
-            <w:vAlign w:val="center"/>
-            <w:shd w:fill="EAF2F8"/>
-            <w:tcMar>
-              <w:top w:w="70" w:type="dxa"/>
-              <w:left w:w="70" w:type="dxa"/>
-              <w:bottom w:w="70" w:type="dxa"/>
-              <w:right w:w="70" w:type="dxa"/>
-            </w:tcMar>
-          </w:tcPr>
-          <w:p>
-            <w:pPr>
+        <w:trPr>
+          <w:cantSplit/>
+        </w:trPr>
+        <w:tc>
+          <w:tcPr>
+            <w:tcW w:w="2472" w:type="dxa"/>
+            <w:vAlign w:val="center"/>
+          </w:tcPr>
+          <w:p>
+            <w:pPr>
+              <w:pStyle w:val="TablaInforme"/>
               <w:jc w:val="left"/>
             </w:pPr>
             <w:r>
-              <w:rPr>
-                <w:sz w:val="15"/>
-              </w:rPr>
-              <w:t>PAS media (mmHg)</w:t>
-            </w:r>
-          </w:p>
-        </w:tc>
-        <w:tc>
-          <w:tcPr>
-            <w:tcW w:type="dxa" w:w="936"/>
-            <w:vAlign w:val="center"/>
-            <w:shd w:fill="EAF2F8"/>
-            <w:tcMar>
-              <w:top w:w="70" w:type="dxa"/>
-              <w:left w:w="70" w:type="dxa"/>
-              <w:bottom w:w="70" w:type="dxa"/>
-              <w:right w:w="70" w:type="dxa"/>
-            </w:tcMar>
-          </w:tcPr>
-          <w:p>
-            <w:pPr>
-              <w:jc w:val="center"/>
-            </w:pPr>
-            <w:r>
-              <w:rPr>
-                <w:sz w:val="15"/>
-              </w:rPr>
-              <w:t>132,35</w:t>
-            </w:r>
-          </w:p>
-        </w:tc>
-        <w:tc>
-          <w:tcPr>
-            <w:tcW w:type="dxa" w:w="1469"/>
-            <w:vAlign w:val="center"/>
-            <w:shd w:fill="EAF2F8"/>
-            <w:tcMar>
-              <w:top w:w="70" w:type="dxa"/>
-              <w:left w:w="70" w:type="dxa"/>
-              <w:bottom w:w="70" w:type="dxa"/>
-              <w:right w:w="70" w:type="dxa"/>
-            </w:tcMar>
-          </w:tcPr>
-          <w:p>
-            <w:pPr>
-              <w:jc w:val="center"/>
-            </w:pPr>
-            <w:r>
-              <w:rPr>
-                <w:sz w:val="15"/>
-              </w:rPr>
-              <w:t>[131,69; 133,02]</w:t>
-            </w:r>
-          </w:p>
-        </w:tc>
-        <w:tc>
-          <w:tcPr>
-            <w:tcW w:type="dxa" w:w="1469"/>
-            <w:vAlign w:val="center"/>
-            <w:shd w:fill="EAF2F8"/>
-            <w:tcMar>
-              <w:top w:w="70" w:type="dxa"/>
-              <w:left w:w="70" w:type="dxa"/>
-              <w:bottom w:w="70" w:type="dxa"/>
-              <w:right w:w="70" w:type="dxa"/>
-            </w:tcMar>
-          </w:tcPr>
-          <w:p>
-            <w:pPr>
-              <w:jc w:val="center"/>
-            </w:pPr>
-            <w:r>
-              <w:rPr>
-                <w:sz w:val="15"/>
-              </w:rPr>
-              <w:t>[131,69; 133,02]</w:t>
-            </w:r>
-          </w:p>
-        </w:tc>
-        <w:tc>
-          <w:tcPr>
-            <w:tcW w:type="dxa" w:w="1469"/>
-            <w:vAlign w:val="center"/>
-            <w:shd w:fill="EAF2F8"/>
-            <w:tcMar>
-              <w:top w:w="70" w:type="dxa"/>
-              <w:left w:w="70" w:type="dxa"/>
-              <w:bottom w:w="70" w:type="dxa"/>
-              <w:right w:w="70" w:type="dxa"/>
-            </w:tcMar>
-          </w:tcPr>
-          <w:p>
-            <w:pPr>
-              <w:jc w:val="center"/>
-            </w:pPr>
-            <w:r>
-              <w:rPr>
-                <w:sz w:val="15"/>
-              </w:rPr>
-              <w:t>[131,70; 133,02]</w:t>
-            </w:r>
-          </w:p>
-        </w:tc>
-        <w:tc>
-          <w:tcPr>
-            <w:tcW w:type="dxa" w:w="1080"/>
-            <w:vAlign w:val="center"/>
-            <w:shd w:fill="EAF2F8"/>
-            <w:tcMar>
-              <w:top w:w="70" w:type="dxa"/>
-              <w:left w:w="70" w:type="dxa"/>
-              <w:bottom w:w="70" w:type="dxa"/>
-              <w:right w:w="70" w:type="dxa"/>
-            </w:tcMar>
-          </w:tcPr>
-          <w:p>
-            <w:pPr>
-              <w:jc w:val="center"/>
-            </w:pPr>
-            <w:r>
-              <w:rPr>
-                <w:sz w:val="15"/>
-              </w:rPr>
-              <w:t>4.240</w:t>
+              <w:t xml:space="preserve">PAS media (mmHg)</w:t>
+            </w:r>
+          </w:p>
+        </w:tc>
+        <w:tc>
+          <w:tcPr>
+            <w:tcW w:w="1100" w:type="dxa"/>
+            <w:vAlign w:val="center"/>
+          </w:tcPr>
+          <w:p>
+            <w:pPr>
+              <w:pStyle w:val="TablaInforme"/>
+              <w:jc w:val="center"/>
+            </w:pPr>
+            <w:r>
+              <w:t xml:space="preserve">132,35</w:t>
+            </w:r>
+          </w:p>
+        </w:tc>
+        <w:tc>
+          <w:tcPr>
+            <w:tcW w:w="1500" w:type="dxa"/>
+            <w:vAlign w:val="center"/>
+          </w:tcPr>
+          <w:p>
+            <w:pPr>
+              <w:pStyle w:val="TablaInforme"/>
+              <w:jc w:val="center"/>
+            </w:pPr>
+            <w:r>
+              <w:t xml:space="preserve">[131,69; 133,02]</w:t>
+            </w:r>
+          </w:p>
+        </w:tc>
+        <w:tc>
+          <w:tcPr>
+            <w:tcW w:w="1500" w:type="dxa"/>
+            <w:vAlign w:val="center"/>
+          </w:tcPr>
+          <w:p>
+            <w:pPr>
+              <w:pStyle w:val="TablaInforme"/>
+              <w:jc w:val="center"/>
+            </w:pPr>
+            <w:r>
+              <w:t xml:space="preserve">[131,69; 133,02]</w:t>
+            </w:r>
+          </w:p>
+        </w:tc>
+        <w:tc>
+          <w:tcPr>
+            <w:tcW w:w="1500" w:type="dxa"/>
+            <w:vAlign w:val="center"/>
+          </w:tcPr>
+          <w:p>
+            <w:pPr>
+              <w:pStyle w:val="TablaInforme"/>
+              <w:jc w:val="center"/>
+            </w:pPr>
+            <w:r>
+              <w:t xml:space="preserve">[131,70; 133,02]</w:t>
+            </w:r>
+          </w:p>
+        </w:tc>
+        <w:tc>
+          <w:tcPr>
+            <w:tcW w:w="1000" w:type="dxa"/>
+            <w:vAlign w:val="center"/>
+          </w:tcPr>
+          <w:p>
+            <w:pPr>
+              <w:pStyle w:val="TablaInforme"/>
+              <w:jc w:val="center"/>
+            </w:pPr>
+            <w:r>
+              <w:t xml:space="preserve">4.240</w:t>
             </w:r>
           </w:p>
         </w:tc>
       </w:tr>
       <w:tr>
-        <w:tc>
-          <w:tcPr>
-            <w:tcW w:type="dxa" w:w="2376"/>
-            <w:vAlign w:val="center"/>
-            <w:tcMar>
-              <w:top w:w="70" w:type="dxa"/>
-              <w:left w:w="70" w:type="dxa"/>
-              <w:bottom w:w="70" w:type="dxa"/>
-              <w:right w:w="70" w:type="dxa"/>
-            </w:tcMar>
-          </w:tcPr>
-          <w:p>
-            <w:pPr>
+        <w:trPr>
+          <w:cantSplit/>
+        </w:trPr>
+        <w:tc>
+          <w:tcPr>
+            <w:tcW w:w="2472" w:type="dxa"/>
+            <w:vAlign w:val="center"/>
+          </w:tcPr>
+          <w:p>
+            <w:pPr>
+              <w:pStyle w:val="TablaInforme"/>
               <w:jc w:val="left"/>
             </w:pPr>
             <w:r>
-              <w:rPr>
-                <w:sz w:val="15"/>
-              </w:rPr>
-              <w:t>Colesterol medio (mg/dL)</w:t>
-            </w:r>
-          </w:p>
-        </w:tc>
-        <w:tc>
-          <w:tcPr>
-            <w:tcW w:type="dxa" w:w="936"/>
-            <w:vAlign w:val="center"/>
-            <w:tcMar>
-              <w:top w:w="70" w:type="dxa"/>
-              <w:left w:w="70" w:type="dxa"/>
-              <w:bottom w:w="70" w:type="dxa"/>
-              <w:right w:w="70" w:type="dxa"/>
-            </w:tcMar>
-          </w:tcPr>
-          <w:p>
-            <w:pPr>
-              <w:jc w:val="center"/>
-            </w:pPr>
-            <w:r>
-              <w:rPr>
-                <w:sz w:val="15"/>
-              </w:rPr>
-              <w:t>236,70</w:t>
-            </w:r>
-          </w:p>
-        </w:tc>
-        <w:tc>
-          <w:tcPr>
-            <w:tcW w:type="dxa" w:w="1469"/>
-            <w:vAlign w:val="center"/>
-            <w:tcMar>
-              <w:top w:w="70" w:type="dxa"/>
-              <w:left w:w="70" w:type="dxa"/>
-              <w:bottom w:w="70" w:type="dxa"/>
-              <w:right w:w="70" w:type="dxa"/>
-            </w:tcMar>
-          </w:tcPr>
-          <w:p>
-            <w:pPr>
-              <w:jc w:val="center"/>
-            </w:pPr>
-            <w:r>
-              <w:rPr>
-                <w:sz w:val="15"/>
-              </w:rPr>
-              <w:t>[235,35; 238,05]</w:t>
-            </w:r>
-          </w:p>
-        </w:tc>
-        <w:tc>
-          <w:tcPr>
-            <w:tcW w:type="dxa" w:w="1469"/>
-            <w:vAlign w:val="center"/>
-            <w:tcMar>
-              <w:top w:w="70" w:type="dxa"/>
-              <w:left w:w="70" w:type="dxa"/>
-              <w:bottom w:w="70" w:type="dxa"/>
-              <w:right w:w="70" w:type="dxa"/>
-            </w:tcMar>
-          </w:tcPr>
-          <w:p>
-            <w:pPr>
-              <w:jc w:val="center"/>
-            </w:pPr>
-            <w:r>
-              <w:rPr>
-                <w:sz w:val="15"/>
-              </w:rPr>
-              <w:t>[235,36; 238,05]</w:t>
-            </w:r>
-          </w:p>
-        </w:tc>
-        <w:tc>
-          <w:tcPr>
-            <w:tcW w:type="dxa" w:w="1469"/>
-            <w:vAlign w:val="center"/>
-            <w:tcMar>
-              <w:top w:w="70" w:type="dxa"/>
-              <w:left w:w="70" w:type="dxa"/>
-              <w:bottom w:w="70" w:type="dxa"/>
-              <w:right w:w="70" w:type="dxa"/>
-            </w:tcMar>
-          </w:tcPr>
-          <w:p>
-            <w:pPr>
-              <w:jc w:val="center"/>
-            </w:pPr>
-            <w:r>
-              <w:rPr>
-                <w:sz w:val="15"/>
-              </w:rPr>
-              <w:t>[235,36; 238,05]</w:t>
-            </w:r>
-          </w:p>
-        </w:tc>
-        <w:tc>
-          <w:tcPr>
-            <w:tcW w:type="dxa" w:w="1080"/>
-            <w:vAlign w:val="center"/>
-            <w:tcMar>
-              <w:top w:w="70" w:type="dxa"/>
-              <w:left w:w="70" w:type="dxa"/>
-              <w:bottom w:w="70" w:type="dxa"/>
-              <w:right w:w="70" w:type="dxa"/>
-            </w:tcMar>
-          </w:tcPr>
-          <w:p>
-            <w:pPr>
-              <w:jc w:val="center"/>
-            </w:pPr>
-            <w:r>
-              <w:rPr>
-                <w:sz w:val="15"/>
-              </w:rPr>
-              <w:t>4.190</w:t>
+              <w:t xml:space="preserve">Colesterol medio (mg/dL)</w:t>
+            </w:r>
+          </w:p>
+        </w:tc>
+        <w:tc>
+          <w:tcPr>
+            <w:tcW w:w="1100" w:type="dxa"/>
+            <w:vAlign w:val="center"/>
+          </w:tcPr>
+          <w:p>
+            <w:pPr>
+              <w:pStyle w:val="TablaInforme"/>
+              <w:jc w:val="center"/>
+            </w:pPr>
+            <w:r>
+              <w:t xml:space="preserve">236,70</w:t>
+            </w:r>
+          </w:p>
+        </w:tc>
+        <w:tc>
+          <w:tcPr>
+            <w:tcW w:w="1500" w:type="dxa"/>
+            <w:vAlign w:val="center"/>
+          </w:tcPr>
+          <w:p>
+            <w:pPr>
+              <w:pStyle w:val="TablaInforme"/>
+              <w:jc w:val="center"/>
+            </w:pPr>
+            <w:r>
+              <w:t xml:space="preserve">[235,35; 238,05]</w:t>
+            </w:r>
+          </w:p>
+        </w:tc>
+        <w:tc>
+          <w:tcPr>
+            <w:tcW w:w="1500" w:type="dxa"/>
+            <w:vAlign w:val="center"/>
+          </w:tcPr>
+          <w:p>
+            <w:pPr>
+              <w:pStyle w:val="TablaInforme"/>
+              <w:jc w:val="center"/>
+            </w:pPr>
+            <w:r>
+              <w:t xml:space="preserve">[235,36; 238,05]</w:t>
+            </w:r>
+          </w:p>
+        </w:tc>
+        <w:tc>
+          <w:tcPr>
+            <w:tcW w:w="1500" w:type="dxa"/>
+            <w:vAlign w:val="center"/>
+          </w:tcPr>
+          <w:p>
+            <w:pPr>
+              <w:pStyle w:val="TablaInforme"/>
+              <w:jc w:val="center"/>
+            </w:pPr>
+            <w:r>
+              <w:t xml:space="preserve">[235,36; 238,05]</w:t>
+            </w:r>
+          </w:p>
+        </w:tc>
+        <w:tc>
+          <w:tcPr>
+            <w:tcW w:w="1000" w:type="dxa"/>
+            <w:vAlign w:val="center"/>
+          </w:tcPr>
+          <w:p>
+            <w:pPr>
+              <w:pStyle w:val="TablaInforme"/>
+              <w:jc w:val="center"/>
+            </w:pPr>
+            <w:r>
+              <w:t xml:space="preserve">4.190</w:t>
             </w:r>
           </w:p>
         </w:tc>
       </w:tr>
       <w:tr>
-        <w:tc>
-          <w:tcPr>
-            <w:tcW w:type="dxa" w:w="2376"/>
-            <w:vAlign w:val="center"/>
-            <w:shd w:fill="EAF2F8"/>
-            <w:tcMar>
-              <w:top w:w="70" w:type="dxa"/>
-              <w:left w:w="70" w:type="dxa"/>
-              <w:bottom w:w="70" w:type="dxa"/>
-              <w:right w:w="70" w:type="dxa"/>
-            </w:tcMar>
-          </w:tcPr>
-          <w:p>
-            <w:pPr>
+        <w:trPr>
+          <w:cantSplit/>
+        </w:trPr>
+        <w:tc>
+          <w:tcPr>
+            <w:tcW w:w="2472" w:type="dxa"/>
+            <w:vAlign w:val="center"/>
+          </w:tcPr>
+          <w:p>
+            <w:pPr>
+              <w:pStyle w:val="TablaInforme"/>
               <w:jc w:val="left"/>
             </w:pPr>
             <w:r>
-              <w:rPr>
-                <w:sz w:val="15"/>
-              </w:rPr>
-              <w:t>Proporción CHD (%)</w:t>
-            </w:r>
-          </w:p>
-        </w:tc>
-        <w:tc>
-          <w:tcPr>
-            <w:tcW w:type="dxa" w:w="936"/>
-            <w:vAlign w:val="center"/>
-            <w:shd w:fill="EAF2F8"/>
-            <w:tcMar>
-              <w:top w:w="70" w:type="dxa"/>
-              <w:left w:w="70" w:type="dxa"/>
-              <w:bottom w:w="70" w:type="dxa"/>
-              <w:right w:w="70" w:type="dxa"/>
-            </w:tcMar>
-          </w:tcPr>
-          <w:p>
-            <w:pPr>
-              <w:jc w:val="center"/>
-            </w:pPr>
-            <w:r>
-              <w:rPr>
-                <w:sz w:val="15"/>
-              </w:rPr>
-              <w:t>15,19</w:t>
-            </w:r>
-          </w:p>
-        </w:tc>
-        <w:tc>
-          <w:tcPr>
-            <w:tcW w:type="dxa" w:w="1469"/>
-            <w:vAlign w:val="center"/>
-            <w:shd w:fill="EAF2F8"/>
-            <w:tcMar>
-              <w:top w:w="70" w:type="dxa"/>
-              <w:left w:w="70" w:type="dxa"/>
-              <w:bottom w:w="70" w:type="dxa"/>
-              <w:right w:w="70" w:type="dxa"/>
-            </w:tcMar>
-          </w:tcPr>
-          <w:p>
-            <w:pPr>
-              <w:jc w:val="center"/>
-            </w:pPr>
-            <w:r>
-              <w:rPr>
-                <w:sz w:val="15"/>
-              </w:rPr>
-              <w:t>[14,14; 16,30]</w:t>
-            </w:r>
-          </w:p>
-        </w:tc>
-        <w:tc>
-          <w:tcPr>
-            <w:tcW w:type="dxa" w:w="1469"/>
-            <w:vAlign w:val="center"/>
-            <w:shd w:fill="EAF2F8"/>
-            <w:tcMar>
-              <w:top w:w="70" w:type="dxa"/>
-              <w:left w:w="70" w:type="dxa"/>
-              <w:bottom w:w="70" w:type="dxa"/>
-              <w:right w:w="70" w:type="dxa"/>
-            </w:tcMar>
-          </w:tcPr>
-          <w:p>
-            <w:pPr>
-              <w:jc w:val="center"/>
-            </w:pPr>
-            <w:r>
-              <w:rPr>
-                <w:sz w:val="15"/>
-              </w:rPr>
-              <w:t>[14,10; 16,25]</w:t>
-            </w:r>
-          </w:p>
-        </w:tc>
-        <w:tc>
-          <w:tcPr>
-            <w:tcW w:type="dxa" w:w="1469"/>
-            <w:vAlign w:val="center"/>
-            <w:shd w:fill="EAF2F8"/>
-            <w:tcMar>
-              <w:top w:w="70" w:type="dxa"/>
-              <w:left w:w="70" w:type="dxa"/>
-              <w:bottom w:w="70" w:type="dxa"/>
-              <w:right w:w="70" w:type="dxa"/>
-            </w:tcMar>
-          </w:tcPr>
-          <w:p>
-            <w:pPr>
-              <w:jc w:val="center"/>
-            </w:pPr>
-            <w:r>
-              <w:rPr>
-                <w:sz w:val="15"/>
-              </w:rPr>
-              <w:t>[14,15; 16,27]</w:t>
-            </w:r>
-          </w:p>
-        </w:tc>
-        <w:tc>
-          <w:tcPr>
-            <w:tcW w:type="dxa" w:w="1080"/>
-            <w:vAlign w:val="center"/>
-            <w:shd w:fill="EAF2F8"/>
-            <w:tcMar>
-              <w:top w:w="70" w:type="dxa"/>
-              <w:left w:w="70" w:type="dxa"/>
-              <w:bottom w:w="70" w:type="dxa"/>
-              <w:right w:w="70" w:type="dxa"/>
-            </w:tcMar>
-          </w:tcPr>
-          <w:p>
-            <w:pPr>
-              <w:jc w:val="center"/>
-            </w:pPr>
-            <w:r>
-              <w:rPr>
-                <w:sz w:val="15"/>
-              </w:rPr>
-              <w:t>4.240</w:t>
+              <w:t xml:space="preserve">Proporción de CHD (%)</w:t>
+            </w:r>
+          </w:p>
+        </w:tc>
+        <w:tc>
+          <w:tcPr>
+            <w:tcW w:w="1100" w:type="dxa"/>
+            <w:vAlign w:val="center"/>
+          </w:tcPr>
+          <w:p>
+            <w:pPr>
+              <w:pStyle w:val="TablaInforme"/>
+              <w:jc w:val="center"/>
+            </w:pPr>
+            <w:r>
+              <w:t xml:space="preserve">15,19</w:t>
+            </w:r>
+          </w:p>
+        </w:tc>
+        <w:tc>
+          <w:tcPr>
+            <w:tcW w:w="1500" w:type="dxa"/>
+            <w:vAlign w:val="center"/>
+          </w:tcPr>
+          <w:p>
+            <w:pPr>
+              <w:pStyle w:val="TablaInforme"/>
+              <w:jc w:val="center"/>
+            </w:pPr>
+            <w:r>
+              <w:t xml:space="preserve">[14,14; 16,30]</w:t>
+            </w:r>
+          </w:p>
+        </w:tc>
+        <w:tc>
+          <w:tcPr>
+            <w:tcW w:w="1500" w:type="dxa"/>
+            <w:vAlign w:val="center"/>
+          </w:tcPr>
+          <w:p>
+            <w:pPr>
+              <w:pStyle w:val="TablaInforme"/>
+              <w:jc w:val="center"/>
+            </w:pPr>
+            <w:r>
+              <w:t xml:space="preserve">[14,10; 16,25]</w:t>
+            </w:r>
+          </w:p>
+        </w:tc>
+        <w:tc>
+          <w:tcPr>
+            <w:tcW w:w="1500" w:type="dxa"/>
+            <w:vAlign w:val="center"/>
+          </w:tcPr>
+          <w:p>
+            <w:pPr>
+              <w:pStyle w:val="TablaInforme"/>
+              <w:jc w:val="center"/>
+            </w:pPr>
+            <w:r>
+              <w:t xml:space="preserve">[14,15; 16,27]</w:t>
+            </w:r>
+          </w:p>
+        </w:tc>
+        <w:tc>
+          <w:tcPr>
+            <w:tcW w:w="1000" w:type="dxa"/>
+            <w:vAlign w:val="center"/>
+          </w:tcPr>
+          <w:p>
+            <w:pPr>
+              <w:pStyle w:val="TablaInforme"/>
+              <w:jc w:val="center"/>
+            </w:pPr>
+            <w:r>
+              <w:t xml:space="preserve">4.240</w:t>
             </w:r>
           </w:p>
         </w:tc>
       </w:tr>
       <w:tr>
-        <w:tc>
-          <w:tcPr>
-            <w:tcW w:type="dxa" w:w="2376"/>
-            <w:vAlign w:val="center"/>
-            <w:tcMar>
-              <w:top w:w="70" w:type="dxa"/>
-              <w:left w:w="70" w:type="dxa"/>
-              <w:bottom w:w="70" w:type="dxa"/>
-              <w:right w:w="70" w:type="dxa"/>
-            </w:tcMar>
-          </w:tcPr>
-          <w:p>
-            <w:pPr>
+        <w:trPr>
+          <w:cantSplit/>
+        </w:trPr>
+        <w:tc>
+          <w:tcPr>
+            <w:tcW w:w="2472" w:type="dxa"/>
+            <w:vAlign w:val="center"/>
+          </w:tcPr>
+          <w:p>
+            <w:pPr>
+              <w:pStyle w:val="TablaInforme"/>
               <w:jc w:val="left"/>
             </w:pPr>
             <w:r>
-              <w:rPr>
-                <w:sz w:val="15"/>
-              </w:rPr>
-              <w:t>Diferencia de glucosa (mg/dL)</w:t>
-            </w:r>
-          </w:p>
-        </w:tc>
-        <w:tc>
-          <w:tcPr>
-            <w:tcW w:type="dxa" w:w="936"/>
-            <w:vAlign w:val="center"/>
-            <w:tcMar>
-              <w:top w:w="70" w:type="dxa"/>
-              <w:left w:w="70" w:type="dxa"/>
-              <w:bottom w:w="70" w:type="dxa"/>
-              <w:right w:w="70" w:type="dxa"/>
-            </w:tcMar>
-          </w:tcPr>
-          <w:p>
-            <w:pPr>
-              <w:jc w:val="center"/>
-            </w:pPr>
-            <w:r>
-              <w:rPr>
-                <w:sz w:val="15"/>
-              </w:rPr>
-              <w:t>8,33</w:t>
-            </w:r>
-          </w:p>
-        </w:tc>
-        <w:tc>
-          <w:tcPr>
-            <w:tcW w:type="dxa" w:w="1469"/>
-            <w:vAlign w:val="center"/>
-            <w:tcMar>
-              <w:top w:w="70" w:type="dxa"/>
-              <w:left w:w="70" w:type="dxa"/>
-              <w:bottom w:w="70" w:type="dxa"/>
-              <w:right w:w="70" w:type="dxa"/>
-            </w:tcMar>
-          </w:tcPr>
-          <w:p>
-            <w:pPr>
-              <w:jc w:val="center"/>
-            </w:pPr>
-            <w:r>
-              <w:rPr>
-                <w:sz w:val="15"/>
-              </w:rPr>
-              <w:t>[4,95; 11,71]</w:t>
-            </w:r>
-          </w:p>
-        </w:tc>
-        <w:tc>
-          <w:tcPr>
-            <w:tcW w:type="dxa" w:w="1469"/>
-            <w:vAlign w:val="center"/>
-            <w:tcMar>
-              <w:top w:w="70" w:type="dxa"/>
-              <w:left w:w="70" w:type="dxa"/>
-              <w:bottom w:w="70" w:type="dxa"/>
-              <w:right w:w="70" w:type="dxa"/>
-            </w:tcMar>
-          </w:tcPr>
-          <w:p>
-            <w:pPr>
-              <w:jc w:val="center"/>
-            </w:pPr>
-            <w:r>
-              <w:rPr>
-                <w:sz w:val="15"/>
-              </w:rPr>
-              <w:t>[5,10; 11,83]</w:t>
-            </w:r>
-          </w:p>
-        </w:tc>
-        <w:tc>
-          <w:tcPr>
-            <w:tcW w:type="dxa" w:w="1469"/>
-            <w:vAlign w:val="center"/>
-            <w:tcMar>
-              <w:top w:w="70" w:type="dxa"/>
-              <w:left w:w="70" w:type="dxa"/>
-              <w:bottom w:w="70" w:type="dxa"/>
-              <w:right w:w="70" w:type="dxa"/>
-            </w:tcMar>
-          </w:tcPr>
-          <w:p>
-            <w:pPr>
-              <w:jc w:val="center"/>
-            </w:pPr>
-            <w:r>
-              <w:rPr>
-                <w:sz w:val="15"/>
-              </w:rPr>
-              <w:t>[5,32; 12,16]</w:t>
-            </w:r>
-          </w:p>
-        </w:tc>
-        <w:tc>
-          <w:tcPr>
-            <w:tcW w:type="dxa" w:w="1080"/>
-            <w:vAlign w:val="center"/>
-            <w:tcMar>
-              <w:top w:w="70" w:type="dxa"/>
-              <w:left w:w="70" w:type="dxa"/>
-              <w:bottom w:w="70" w:type="dxa"/>
-              <w:right w:w="70" w:type="dxa"/>
-            </w:tcMar>
-          </w:tcPr>
-          <w:p>
-            <w:pPr>
-              <w:jc w:val="center"/>
-            </w:pPr>
-            <w:r>
-              <w:rPr>
-                <w:sz w:val="15"/>
-              </w:rPr>
-              <w:t>594 / 3.258</w:t>
+              <w:t xml:space="preserve">Diferencia de PAS (mmHg)</w:t>
+            </w:r>
+          </w:p>
+        </w:tc>
+        <w:tc>
+          <w:tcPr>
+            <w:tcW w:w="1100" w:type="dxa"/>
+            <w:vAlign w:val="center"/>
+          </w:tcPr>
+          <w:p>
+            <w:pPr>
+              <w:pStyle w:val="TablaInforme"/>
+              <w:jc w:val="center"/>
+            </w:pPr>
+            <w:r>
+              <w:t xml:space="preserve">13,28</w:t>
+            </w:r>
+          </w:p>
+        </w:tc>
+        <w:tc>
+          <w:tcPr>
+            <w:tcW w:w="1500" w:type="dxa"/>
+            <w:vAlign w:val="center"/>
+          </w:tcPr>
+          <w:p>
+            <w:pPr>
+              <w:pStyle w:val="TablaInforme"/>
+              <w:jc w:val="center"/>
+            </w:pPr>
+            <w:r>
+              <w:t xml:space="preserve">[11,11; 15,45]</w:t>
+            </w:r>
+          </w:p>
+        </w:tc>
+        <w:tc>
+          <w:tcPr>
+            <w:tcW w:w="1500" w:type="dxa"/>
+            <w:vAlign w:val="center"/>
+          </w:tcPr>
+          <w:p>
+            <w:pPr>
+              <w:pStyle w:val="TablaInforme"/>
+              <w:jc w:val="center"/>
+            </w:pPr>
+            <w:r>
+              <w:t xml:space="preserve">[11,09; 15,53]</w:t>
+            </w:r>
+          </w:p>
+        </w:tc>
+        <w:tc>
+          <w:tcPr>
+            <w:tcW w:w="1500" w:type="dxa"/>
+            <w:vAlign w:val="center"/>
+          </w:tcPr>
+          <w:p>
+            <w:pPr>
+              <w:pStyle w:val="TablaInforme"/>
+              <w:jc w:val="center"/>
+            </w:pPr>
+            <w:r>
+              <w:t xml:space="preserve">[11,14; 15,60]</w:t>
+            </w:r>
+          </w:p>
+        </w:tc>
+        <w:tc>
+          <w:tcPr>
+            <w:tcW w:w="1000" w:type="dxa"/>
+            <w:vAlign w:val="center"/>
+          </w:tcPr>
+          <w:p>
+            <w:pPr>
+              <w:pStyle w:val="TablaInforme"/>
+              <w:jc w:val="center"/>
+            </w:pPr>
+            <w:r>
+              <w:t xml:space="preserve">644 / 3.596</w:t>
+            </w:r>
+          </w:p>
+        </w:tc>
+      </w:tr>
+      <w:tr>
+        <w:trPr>
+          <w:cantSplit/>
+        </w:trPr>
+        <w:tc>
+          <w:tcPr>
+            <w:tcW w:w="2472" w:type="dxa"/>
+            <w:vAlign w:val="center"/>
+          </w:tcPr>
+          <w:p>
+            <w:pPr>
+              <w:pStyle w:val="TablaInforme"/>
+              <w:jc w:val="left"/>
+            </w:pPr>
+            <w:r>
+              <w:t xml:space="preserve">Diferencia de glucosa (mg/dL)</w:t>
+            </w:r>
+          </w:p>
+        </w:tc>
+        <w:tc>
+          <w:tcPr>
+            <w:tcW w:w="1100" w:type="dxa"/>
+            <w:vAlign w:val="center"/>
+          </w:tcPr>
+          <w:p>
+            <w:pPr>
+              <w:pStyle w:val="TablaInforme"/>
+              <w:jc w:val="center"/>
+            </w:pPr>
+            <w:r>
+              <w:t xml:space="preserve">8,33</w:t>
+            </w:r>
+          </w:p>
+        </w:tc>
+        <w:tc>
+          <w:tcPr>
+            <w:tcW w:w="1500" w:type="dxa"/>
+            <w:vAlign w:val="center"/>
+          </w:tcPr>
+          <w:p>
+            <w:pPr>
+              <w:pStyle w:val="TablaInforme"/>
+              <w:jc w:val="center"/>
+            </w:pPr>
+            <w:r>
+              <w:t xml:space="preserve">[4,95; 11,71]</w:t>
+            </w:r>
+          </w:p>
+        </w:tc>
+        <w:tc>
+          <w:tcPr>
+            <w:tcW w:w="1500" w:type="dxa"/>
+            <w:vAlign w:val="center"/>
+          </w:tcPr>
+          <w:p>
+            <w:pPr>
+              <w:pStyle w:val="TablaInforme"/>
+              <w:jc w:val="center"/>
+            </w:pPr>
+            <w:r>
+              <w:t xml:space="preserve">[5,10; 11,83]</w:t>
+            </w:r>
+          </w:p>
+        </w:tc>
+        <w:tc>
+          <w:tcPr>
+            <w:tcW w:w="1500" w:type="dxa"/>
+            <w:vAlign w:val="center"/>
+          </w:tcPr>
+          <w:p>
+            <w:pPr>
+              <w:pStyle w:val="TablaInforme"/>
+              <w:jc w:val="center"/>
+            </w:pPr>
+            <w:r>
+              <w:t xml:space="preserve">[5,32; 12,16]</w:t>
+            </w:r>
+          </w:p>
+        </w:tc>
+        <w:tc>
+          <w:tcPr>
+            <w:tcW w:w="1000" w:type="dxa"/>
+            <w:vAlign w:val="center"/>
+          </w:tcPr>
+          <w:p>
+            <w:pPr>
+              <w:pStyle w:val="TablaInforme"/>
+              <w:jc w:val="center"/>
+            </w:pPr>
+            <w:r>
+              <w:t xml:space="preserve">594 / 3.258</w:t>
             </w:r>
           </w:p>
         </w:tc>
@@ -1772,28 +1619,26 @@
     </w:tbl>
     <w:p>
       <w:pPr>
+        <w:pStyle w:val="Espacio"/>
+      </w:pPr>
+    </w:p>
+    <w:p>
+      <w:pPr>
         <w:pStyle w:val="CuerpoInforme"/>
-        <w:spacing w:after="100" w:line="240" w:lineRule="auto"/>
-        <w:jc w:val="both"/>
-      </w:pPr>
-      <w:r>
-        <w:rPr>
-          <w:sz w:val="19"/>
-        </w:rPr>
-        <w:t>Los cuatro estimadores globales muestran una concordancia casi exacta entre los intervalos clásicos y bootstrap. El gran tamaño muestral estabiliza las medias mediante el Teorema Central del Límite, mientras que Wilson y bootstrap entregan resultados equivalentes para la proporción de CHD. La glucosa es la excepción relevante: su IC BCa [5,32; 12,16] se desplaza hacia valores mayores respecto de Welch [4,95; 11,71]. Esto no cambia la conclusión, porque ambos intervalos excluyen cero, pero sí evidencia incertidumbre asimétrica. La distribución de glucosa tiene cola derecha, valores cercanos a 400 mg/dL y mayor dispersión en el grupo con CHD; Welch impone simetría alrededor de la diferencia, mientras BCa corrige el sesgo y la aceleración observados. Por ello, BCa es más informativo en este caso, aunque la media sigue siendo sensible a extremos y a los 388 valores faltantes; conviene complementar con medianas o medias recortadas.</w:t>
-      </w:r>
-    </w:p>
-    <w:p>
-      <w:pPr>
-        <w:pStyle w:val="CuerpoInforme"/>
+      </w:pPr>
+      <w:r>
+        <w:t xml:space="preserve">Los cuatro estimadores globales muestran una concordancia casi exacta entre los intervalos clásicos y bootstrap. El gran tamaño muestral estabiliza las medias mediante el Teorema Central del Límite, mientras que Wilson y bootstrap entregan resultados equivalentes para la proporción de CHD. La diferencia de PAS entre participantes con y sin CHD, cuyo remuestreo pidió el docente, también se valida: su IC BCa [11,14; 15,60] es casi igual al de Welch [11,11; 15,45]. La glucosa es la excepción relevante: su IC BCa [5,32; 12,16] se desplaza hacia valores mayores respecto de Welch [4,95; 11,71]. Esto no cambia la conclusión, porque ambos intervalos excluyen cero, pero sí evidencia incertidumbre asimétrica. La distribución de glucosa tiene cola derecha, valores cercanos a 400 mg/dL y mayor dispersión en el grupo con CHD; Welch impone simetría alrededor de la diferencia, mientras BCa corrige el sesgo y la aceleración observados. Por ello, BCa es más informativo en este caso, aunque la media sigue siendo sensible a extremos y a los 388 valores faltantes; conviene complementar con medianas o medias recortadas.</w:t>
+      </w:r>
+    </w:p>
+    <w:p>
+      <w:pPr>
+        <w:pStyle w:val="Figura"/>
         <w:keepNext/>
-        <w:spacing w:before="40" w:after="40"/>
-        <w:jc w:val="center"/>
       </w:pPr>
       <w:r>
         <w:drawing>
           <wp:inline xmlns:a="http://schemas.openxmlformats.org/drawingml/2006/main" xmlns:pic="http://schemas.openxmlformats.org/drawingml/2006/picture">
-            <wp:extent cx="5394960" cy="3149659"/>
+            <wp:extent cx="4140000" cy="2416994"/>
             <wp:docPr id="303" name="Picture 303"/>
             <wp:cNvGraphicFramePr>
               <a:graphicFrameLocks noChangeAspect="1"/>
@@ -1814,7 +1659,7 @@
                   <pic:spPr>
                     <a:xfrm>
                       <a:off x="0" y="0"/>
-                      <a:ext cx="5394960" cy="3149659"/>
+                      <a:ext cx="4140000" cy="2416994"/>
                     </a:xfrm>
                     <a:prstGeom prst="rect"/>
                   </pic:spPr>
@@ -1827,70 +1672,124 @@
     </w:p>
     <w:p>
       <w:pPr>
+        <w:pStyle w:val="Caption"/>
+      </w:pPr>
+      <w:r>
+        <w:rPr>
+          <w:b/>
+          <w:bCs/>
+        </w:rPr>
+        <w:t xml:space="preserve">Figura 1.</w:t>
+      </w:r>
+      <w:r>
+        <w:t xml:space="preserve"> Distribuciones bootstrap e intervalos de confianza al 95 % de los seis parámetros.</w:t>
+      </w:r>
+    </w:p>
+    <w:p>
+      <w:pPr>
+        <w:pStyle w:val="Heading1"/>
+      </w:pPr>
+      <w:bookmarkStart w:id="202" w:name="_Toc000000202"/>
+      <w:r>
+        <w:t xml:space="preserve">Validación de las pruebas de hipótesis mediante permutación</w:t>
+      </w:r>
+      <w:bookmarkEnd w:id="202"/>
+    </w:p>
+    <w:p>
+      <w:pPr>
         <w:pStyle w:val="CuerpoInforme"/>
-        <w:spacing w:after="120"/>
-        <w:jc w:val="center"/>
+      </w:pPr>
+      <w:r>
+        <w:t xml:space="preserve">Se revalidaron tres contrastes de la Sumativa 1 mediante 10.000 permutaciones. La diferencia de PAS entre participantes con y sin CHD fue 13,28 mmHg: tanto Welch (p &lt; 0,001) como la permutación (p &lt; 0,001) rechazan la igualdad de medias. Para tabaquismo y CHD, el contraste χ² con corrección de Yates (p = 0,221) y la permutación de la diferencia de tasas (p = 0,210) coinciden en no rechazar la independencia. Sin embargo, la permutación estratificada por edad y la prueba de Cochran–Mantel–Haenszel entregan p &lt; 0,001. La discrepancia no proviene del método computacional, sino de la confusión por edad: dentro de los estratos hasta 55 años, los fumadores presentan entre 4,2 y 5,5 puntos porcentuales más CHD, mientras que en mayores de 55 años el IC incluye cero. La Figura 2 muestra las distribuciones nulas; su convergencia se presenta en el notebook. Para la siguiente fase, el tabaquismo debe evaluarse ajustado por edad y no solo mediante la comparación marginal.</w:t>
+      </w:r>
+    </w:p>
+    <w:p>
+      <w:pPr>
+        <w:pStyle w:val="Figura"/>
+        <w:keepNext/>
+      </w:pPr>
+      <w:r>
+        <w:drawing>
+          <wp:inline distT="0" distB="0" distL="0" distR="0">
+            <wp:extent cx="5400000" cy="1570677"/>
+            <wp:effectExtent l="0" t="0" r="0" b="0"/>
+            <wp:docPr id="401" name="Figura 401" descr="Distribuciones nulas de permutación para las tres pruebas."/>
+            <wp:cNvGraphicFramePr>
+              <a:graphicFrameLocks xmlns:a="http://schemas.openxmlformats.org/drawingml/2006/main" noChangeAspect="1"/>
+            </wp:cNvGraphicFramePr>
+            <a:graphic xmlns:a="http://schemas.openxmlformats.org/drawingml/2006/main">
+              <a:graphicData uri="http://schemas.openxmlformats.org/drawingml/2006/picture">
+                <pic:pic xmlns:pic="http://schemas.openxmlformats.org/drawingml/2006/picture">
+                  <pic:nvPicPr>
+                    <pic:cNvPr id="0" name="p2_fig1_permutacion.png"/>
+                    <pic:cNvPicPr>
+                      <a:picLocks noChangeAspect="1"/>
+                    </pic:cNvPicPr>
+                  </pic:nvPicPr>
+                  <pic:blipFill>
+                    <a:blip r:embed="rId401"/>
+                    <a:stretch>
+                      <a:fillRect/>
+                    </a:stretch>
+                  </pic:blipFill>
+                  <pic:spPr>
+                    <a:xfrm>
+                      <a:off x="0" y="0"/>
+                      <a:ext cx="5400000" cy="1570677"/>
+                    </a:xfrm>
+                    <a:prstGeom prst="rect">
+                      <a:avLst/>
+                    </a:prstGeom>
+                  </pic:spPr>
+                </pic:pic>
+              </a:graphicData>
+            </a:graphic>
+          </wp:inline>
+        </w:drawing>
+      </w:r>
+    </w:p>
+    <w:p>
+      <w:pPr>
+        <w:pStyle w:val="Caption"/>
       </w:pPr>
       <w:r>
         <w:rPr>
-          <w:i/>
-          <w:sz w:val="16"/>
+          <w:b/>
+          <w:bCs/>
         </w:rPr>
-        <w:t>Figura 1. Distribuciones bootstrap e intervalos de confianza al 95 % para los cinco estimadores.</w:t>
+        <w:t xml:space="preserve">Figura 2.</w:t>
+      </w:r>
+      <w:r>
+        <w:t xml:space="preserve"> Distribuciones nulas de las pruebas de permutación (10.000 permutaciones). La línea roja indica el valor observado y las líneas punteadas, los valores críticos al 5 %.</w:t>
       </w:r>
     </w:p>
     <w:p>
       <w:pPr>
         <w:pStyle w:val="Heading1"/>
       </w:pPr>
-      <w:bookmarkStart w:id="202" w:name="_Toc000000202"/>
-      <w:r>
-        <w:t xml:space="preserve">Validación de las pruebas de hipótesis mediante permutación</w:t>
-      </w:r>
-      <w:bookmarkEnd w:id="202"/>
+      <w:bookmarkStart w:id="203" w:name="_Toc000000203"/>
+      <w:r>
+        <w:t xml:space="preserve">Estabilidad de las correlaciones</w:t>
+      </w:r>
+      <w:bookmarkEnd w:id="203"/>
     </w:p>
     <w:p>
       <w:pPr>
         <w:pStyle w:val="CuerpoInforme"/>
       </w:pPr>
       <w:r>
-        <w:t>Se revalidaron tres contrastes de la Sumativa 1 mediante 10.000 permutaciones. La diferencia de PAS entre participantes con y sin CHD fue 13,28 mmHg: tanto Welch (p &lt; 0,001) como la permutación (p &lt; 0,001) rechazan la igualdad de medias. Para tabaquismo y CHD, el contraste χ² con corrección de Yates (p = 0,221) y la permutación de la diferencia de tasas (p = 0,210) coinciden en no rechazar la independencia. Sin embargo, la permutación estratificada por edad y la prueba de Cochran–Mantel–Haenszel entregan p &lt; 0,001. La discrepancia no proviene del método computacional, sino de la confusión por edad: dentro de los estratos hasta 55 años, los fumadores presentan entre 4,2 y 5,5 puntos porcentuales más CHD, mientras que en mayores de 55 años el IC incluye cero. Las distribuciones nulas y su convergencia se presentan en el notebook. Para la siguiente fase, el tabaquismo debe evaluarse ajustado por edad y no solo mediante la comparación marginal.</w:t>
-      </w:r>
-    </w:p>
-    <w:p>
-      <w:pPr>
-        <w:pStyle w:val="Heading1"/>
-      </w:pPr>
-      <w:bookmarkStart w:id="203" w:name="_Toc000000203"/>
-      <w:r>
-        <w:t xml:space="preserve">Estabilidad de las correlaciones</w:t>
-      </w:r>
-      <w:bookmarkEnd w:id="203"/>
-    </w:p>
-    <w:p>
-      <w:pPr>
-        <w:pStyle w:val="CuerpoInforme"/>
-        <w:spacing w:after="100" w:line="240" w:lineRule="auto"/>
-        <w:jc w:val="both"/>
-      </w:pPr>
-      <w:r>
-        <w:rPr>
-          <w:sz w:val="18"/>
-        </w:rPr>
-        <w:t>Se remuestrearon filas completas 10.000 veces para cinco correlaciones de Spearman. Las relaciones PAS–PAD (ρ = 0,778; IC 95 % [0,763; 0,791]), edad–PAS (ρ = 0,391; [0,365; 0,417]) e IMC–PAD (ρ = 0,375; [0,348; 0,401]) son robustas: sus intervalos son estrechos y excluyen cero. Colesterol–glucosa es inestable (ρ = 0,030; [−0,002; 0,061]) porque el intervalo incluye cero. Cigarrillos–glucosa mantiene dirección negativa (ρ = −0,086; [−0,118; −0,055]), pero el efecto es débil; significación estable no implica relevancia clínica. Para la Sumativa 3, la fuerte relación entre ambas presiones aconseja evitar incorporarlas simultáneamente sin controlar colinealidad.</w:t>
-      </w:r>
-    </w:p>
-    <w:p>
-      <w:pPr>
-        <w:pStyle w:val="CuerpoInforme"/>
+        <w:t xml:space="preserve">Se remuestrearon filas completas 10.000 veces para cinco correlaciones de Spearman. Las relaciones PAS–PAD (ρ = 0,778; IC 95 % [0,763; 0,791]), edad–PAS (ρ = 0,391; [0,365; 0,417]) e IMC–PAD (ρ = 0,375; [0,348; 0,401]) son robustas: sus intervalos son estrechos y excluyen cero. Colesterol–glucosa es inestable (ρ = 0,030; [−0,002; 0,061]) porque el intervalo incluye cero. Cigarrillos–glucosa mantiene dirección negativa (ρ = −0,086; [−0,118; −0,055]), pero el efecto es débil; significación estable no implica relevancia clínica. Para la Sumativa 3, la fuerte relación entre ambas presiones aconseja evitar incorporarlas simultáneamente sin controlar colinealidad.</w:t>
+      </w:r>
+    </w:p>
+    <w:p>
+      <w:pPr>
+        <w:pStyle w:val="Figura"/>
         <w:keepNext/>
-        <w:spacing w:before="40" w:after="40"/>
-        <w:jc w:val="center"/>
       </w:pPr>
       <w:r>
         <w:drawing>
           <wp:inline xmlns:a="http://schemas.openxmlformats.org/drawingml/2006/main" xmlns:pic="http://schemas.openxmlformats.org/drawingml/2006/picture">
-            <wp:extent cx="4663440" cy="2644004"/>
+            <wp:extent cx="2880000" cy="1632857"/>
             <wp:docPr id="304" name="Picture 304"/>
             <wp:cNvGraphicFramePr>
               <a:graphicFrameLocks noChangeAspect="1"/>
@@ -1911,7 +1810,7 @@
                   <pic:spPr>
                     <a:xfrm>
                       <a:off x="0" y="0"/>
-                      <a:ext cx="4663440" cy="2644004"/>
+                      <a:ext cx="2880000" cy="1632857"/>
                     </a:xfrm>
                     <a:prstGeom prst="rect"/>
                   </pic:spPr>
@@ -1924,16 +1823,17 @@
     </w:p>
     <w:p>
       <w:pPr>
-        <w:pStyle w:val="CuerpoInforme"/>
-        <w:spacing w:after="100"/>
-        <w:jc w:val="center"/>
+        <w:pStyle w:val="Caption"/>
       </w:pPr>
       <w:r>
         <w:rPr>
-          <w:i/>
-          <w:sz w:val="16"/>
+          <w:b/>
+          <w:bCs/>
         </w:rPr>
-        <w:t>Figura 2. Correlaciones de Spearman e intervalos bootstrap percentil al 95 %.</w:t>
+        <w:t xml:space="preserve">Figura 3.</w:t>
+      </w:r>
+      <w:r>
+        <w:t xml:space="preserve"> Correlaciones de Spearman e intervalos bootstrap percentil al 95 %.</w:t>
       </w:r>
     </w:p>
     <w:p>
@@ -2017,7 +1917,7 @@
         <w:pStyle w:val="CuerpoInforme"/>
       </w:pPr>
       <w:r>
-        <w:t>El escenario A es coherente con los datos reales: sin programa se esperan 151,7 casos por 1.000 personas (15,17 %), prácticamente igual a la tasa observada en la S1 (15,19 %; IC 95 %: 14,14 a 16,30). Los casos evitados aumentan en proporción a la cobertura del programa (Tabla 2 y Figura 3). Con 40 % de hipertensos controlados se evitan en promedio 17,1 casos (IC 95 %: 10 a 26), lo que equivale a controlar unos 7 hipertensos por caso evitado. Con 20 % de cobertura el beneficio es incierto, ya que solo el 35 % de las cohortes evita 10 casos o más. Incorporar la incertidumbre de los parámetros casi no cambia el resultado (la desviación estándar pasa de 4,1 a 4,5 casos): con más de 4.000 observaciones, la variabilidad se debe sobre todo al azar entre personas.</w:t>
+        <w:t>El escenario A es coherente con los datos reales: sin programa se esperan 151,7 casos por 1.000 personas (15,17 %), prácticamente igual a la tasa observada en la S1 (15,19 %; IC 95 %: 14,14 a 16,30). Los casos evitados aumentan en proporción a la cobertura del programa (Tabla 2 y Figura 4). Con 40 % de hipertensos controlados se evitan en promedio 17,1 casos (IC 95 %: 10 a 26), lo que equivale a controlar unos 7 hipertensos por caso evitado. Con 20 % de cobertura el beneficio es incierto, ya que solo el 35 % de las cohortes evita 10 casos o más. Incorporar la incertidumbre de los parámetros casi no cambia el resultado (la desviación estándar pasa de 4,1 a 4,5 casos): con más de 4.000 observaciones, la variabilidad se debe sobre todo al azar entre personas.</w:t>
       </w:r>
     </w:p>
     <w:p>
@@ -2026,7 +1926,14 @@
         <w:keepNext/>
       </w:pPr>
       <w:r>
-        <w:t>Tabla 2. Escenario A: casos de CHD a 10 años por 1.000 personas según la cobertura del programa (10.000 cohortes simuladas).</w:t>
+        <w:rPr>
+          <w:b/>
+          <w:bCs/>
+        </w:rPr>
+        <w:t xml:space="preserve">Tabla 2.</w:t>
+      </w:r>
+      <w:r>
+        <w:t xml:space="preserve"> Escenario A: casos de CHD a 10 años por 1.000 personas según la cobertura del programa (10.000 cohortes simuladas).</w:t>
       </w:r>
     </w:p>
     <w:tbl>
@@ -2490,7 +2397,7 @@
       <w:r>
         <w:drawing>
           <wp:inline distT="0" distB="0" distL="0" distR="0">
-            <wp:extent cx="5580000" cy="2002017"/>
+            <wp:extent cx="4320000" cy="1549948"/>
             <wp:effectExtent l="0" t="0" r="0" b="0"/>
             <wp:docPr id="301" name="Figura 301" descr="Casos de CHD por cohorte con y sin programa y casos evitados según cobertura."/>
             <wp:cNvGraphicFramePr>
@@ -2514,7 +2421,7 @@
                   <pic:spPr>
                     <a:xfrm>
                       <a:off x="0" y="0"/>
-                      <a:ext cx="5580000" cy="2002017"/>
+                      <a:ext cx="4320000" cy="1549948"/>
                     </a:xfrm>
                     <a:prstGeom prst="rect">
                       <a:avLst/>
@@ -2532,7 +2439,14 @@
         <w:pStyle w:val="Caption"/>
       </w:pPr>
       <w:r>
-        <w:t>Figura 3. Escenario A: casos de CHD por cohorte con y sin programa (izquierda) y casos evitados según la cobertura del programa (derecha).</w:t>
+        <w:rPr>
+          <w:b/>
+          <w:bCs/>
+        </w:rPr>
+        <w:t xml:space="preserve">Figura 4.</w:t>
+      </w:r>
+      <w:r>
+        <w:t xml:space="preserve"> Escenario A: casos de CHD por cohorte con y sin programa (izquierda) y casos evitados según la cobertura del programa (derecha).</w:t>
       </w:r>
     </w:p>
     <w:p>
@@ -2540,7 +2454,7 @@
         <w:pStyle w:val="CuerpoInforme"/>
       </w:pPr>
       <w:r>
-        <w:t>En el escenario B, los datos sintéticos reproducen la media, la desviación estándar y la asimetría de ambos grupos. Con el tamaño muestral de la S1, el IC de Welch cubre la diferencia verdadera en el 95,1 % de las réplicas (error estándar Monte Carlo de 0,2 puntos porcentuales) y la prueba detecta la diferencia en todas ellas (Figura 4), por lo que la conclusión de la S1 no depende del supuesto de normalidad. En cambio, la cobertura baja a 92,7 % con 33 personas y la potencia cae a 52 % con 132. Por ello, no conviene sacar conclusiones en subgrupos pequeños, como diabetes (n = 109) o ACV previo (n = 25).</w:t>
+        <w:t>En el escenario B, los datos sintéticos reproducen la media, la desviación estándar y la asimetría de ambos grupos. Con el tamaño muestral de la S1, el IC de Welch cubre la diferencia verdadera en el 95,1 % de las réplicas (error estándar Monte Carlo de 0,2 puntos porcentuales) y la prueba detecta la diferencia en todas ellas (Figura 5), por lo que la conclusión de la S1 no depende del supuesto de normalidad. En cambio, la cobertura baja a 92,7 % con 33 personas y la potencia cae a 52 % con 132. Por ello, no conviene sacar conclusiones en subgrupos pequeños, como diabetes (n = 109) o ACV previo (n = 25).</w:t>
       </w:r>
     </w:p>
     <w:p>
@@ -2551,7 +2465,7 @@
       <w:r>
         <w:drawing>
           <wp:inline distT="0" distB="0" distL="0" distR="0">
-            <wp:extent cx="5400000" cy="1866159"/>
+            <wp:extent cx="4320000" cy="1492927"/>
             <wp:effectExtent l="0" t="0" r="0" b="0"/>
             <wp:docPr id="302" name="Figura 302" descr="Cobertura del IC 95 % de Welch y potencia según el tamaño muestral."/>
             <wp:cNvGraphicFramePr>
@@ -2575,7 +2489,7 @@
                   <pic:spPr>
                     <a:xfrm>
                       <a:off x="0" y="0"/>
-                      <a:ext cx="5400000" cy="1866159"/>
+                      <a:ext cx="4320000" cy="1492927"/>
                     </a:xfrm>
                     <a:prstGeom prst="rect">
                       <a:avLst/>
@@ -2593,7 +2507,14 @@
         <w:pStyle w:val="Caption"/>
       </w:pPr>
       <w:r>
-        <w:t>Figura 4. Escenario B: cobertura del IC 95 % de Welch (izquierda) y potencia de la prueba (derecha) según el tamaño muestral, con datos sintéticos asimétricos.</w:t>
+        <w:rPr>
+          <w:b/>
+          <w:bCs/>
+        </w:rPr>
+        <w:t xml:space="preserve">Figura 5.</w:t>
+      </w:r>
+      <w:r>
+        <w:t xml:space="preserve"> Escenario B: cobertura del IC 95 % de Welch (izquierda) y potencia de la prueba (derecha) según el tamaño muestral, con datos sintéticos asimétricos.</w:t>
       </w:r>
     </w:p>
     <w:p>
@@ -2665,7 +2586,7 @@
         <w:pStyle w:val="CuerpoInforme"/>
       </w:pPr>
       <w:r>
-        <w:t>El archivo de resultados validados consolida los IC BCa, las pruebas de permutación, las correlaciones estables, las observaciones influyentes y los escenarios Monte Carlo. Como insumos principales para la Sumativa 3 se mantienen: edad media 49,58 años (IC BCa [49,32; 49,85]), PAS media 132,35 mmHg ([131,70; 133,02]), colesterol medio 236,70 mg/dL ([235,36; 238,05]) y prevalencia de CHD de 15,19 % ([14,15 %; 16,27 %]). La diferencia de PAS por CHD se considera robusta en dirección, pero su magnitud debe acompañarse del análisis sin atípicos. La diferencia de glucosa no se utilizará como evidencia confirmatoria sin transformación o métodos robustos.</w:t>
+        <w:t xml:space="preserve">El archivo de resultados validados consolida los IC BCa, las pruebas de permutación, las correlaciones estables, las observaciones influyentes y los escenarios Monte Carlo. Como insumos principales para la Sumativa 3 se mantienen las cuatro estimaciones globales de la Tabla 1 (edad, PAS, colesterol y proporción de CHD), cuyos IC clásicos y bootstrap coinciden. La diferencia de PAS por CHD se considera robusta en dirección, pero su magnitud debe acompañarse del análisis sin atípicos. La diferencia de glucosa no se utilizará como evidencia confirmatoria sin transformación o métodos robustos.</w:t>
       </w:r>
     </w:p>
     <w:p>
@@ -2722,15 +2643,7 @@
         <w:spacing w:after="40"/>
       </w:pPr>
       <w:r>
-        <w:t xml:space="preserve">Incluir solo una de las dos presiones (sistólica o diastólica), porque están fuertemente correlacionadas (ρ = 0,78).</w:t>
-      </w:r>
-    </w:p>
-    <w:p>
-      <w:pPr>
-        <w:pStyle w:val="CuerpoInforme"/>
-      </w:pPr>
-      <w:r>
-        <w:t>Mantener la presión sistólica y excluir la diastólica del modelo principal. Ambas muestran estabilidad, pero la sistólica está directamente vinculada con las hipótesis y la simulación de esta evaluación. Esta decisión deberá contrastarse mediante validación cruzada.</w:t>
+        <w:t xml:space="preserve">Incluir solo una de las dos presiones, porque están fuertemente correlacionadas (ρ = 0,78). Se mantendrá la sistólica y se excluirá la diastólica del modelo principal: ambas son estables, pero la sistólica se vincula directamente con las hipótesis y la simulación de esta evaluación. La decisión se contrastará mediante validación cruzada.</w:t>
       </w:r>
     </w:p>
     <w:p>
@@ -2764,7 +2677,7 @@
         <w:pStyle w:val="CuerpoInforme"/>
       </w:pPr>
       <w:r>
-        <w:t xml:space="preserve">El notebook S2/notebook.ipynb reúne las cinco partes del análisis en el orden de este informe, genera todas las tablas y figuras, y fija la semilla 42 para asegurar la reproducibilidad. El repositorio incluye las carpetas S1 y S2 y el archivo de resultados validados S2/resultados_validados.md, que servirá de base para la Sumativa 3: https://github.com/vbravo29/MCDI501-estadistica-computacional.</w:t>
+        <w:t xml:space="preserve">El notebook S2/notebook.ipynb reproduce todas las tablas y figuras de este informe con semilla 42, y el archivo S2/resultados_validados.md del repositorio resume los resultados que servirán de base para la Sumativa 3.</w:t>
       </w:r>
     </w:p>
     <w:p>

</xml_diff>